<commit_message>
Update documentation to reflect recent project changes (Claude-based weight parsing, updated summary)
</commit_message>
<xml_diff>
--- a/project_plan_skillsforhire.docx
+++ b/project_plan_skillsforhire.docx
@@ -2,6 +2,88 @@
 <file path=word/document.xml><?xml version="1.0" encoding="utf-8"?>
 <w:document xmlns:o="urn:schemas-microsoft-com:office:office" xmlns:r="http://schemas.openxmlformats.org/officeDocument/2006/relationships" xmlns:v="urn:schemas-microsoft-com:vml" xmlns:w="http://schemas.openxmlformats.org/wordprocessingml/2006/main" xmlns:w10="urn:schemas-microsoft-com:office:word" xmlns:wp="http://schemas.openxmlformats.org/drawingml/2006/wordprocessingDrawing" xmlns:pic="http://schemas.openxmlformats.org/drawingml/2006/picture" xmlns:wps="http://schemas.microsoft.com/office/word/2010/wordprocessingShape" xmlns:wpg="http://schemas.microsoft.com/office/word/2010/wordprocessingGroup" xmlns:mc="http://schemas.openxmlformats.org/markup-compatibility/2006" xmlns:wp14="http://schemas.microsoft.com/office/word/2010/wordprocessingDrawing" xmlns:w14="http://schemas.microsoft.com/office/word/2010/wordml" xmlns:w15="http://schemas.microsoft.com/office/word/2012/wordml" mc:Ignorable="w14 wp14 w15">
   <w:body>
+    <w:p>
+      <w:pPr>
+        <w:pStyle w:val="BodyText"/>
+        <w:rPr/>
+      </w:pPr>
+      <w:r>
+        <w:rPr/>
+        <w:drawing>
+          <wp:anchor distT="0" distB="0" distL="0" distR="0" simplePos="0" relativeHeight="2" behindDoc="0" locked="0" layoutInCell="0" allowOverlap="1">
+            <wp:simplePos x="0" y="0"/>
+            <wp:positionH relativeFrom="column">
+              <wp:posOffset>-5715</wp:posOffset>
+            </wp:positionH>
+            <wp:positionV relativeFrom="paragraph">
+              <wp:posOffset>-271780</wp:posOffset>
+            </wp:positionV>
+            <wp:extent cx="5943600" cy="1981200"/>
+            <wp:effectExtent l="0" t="0" r="0" b="0"/>
+            <wp:wrapSquare wrapText="largest"/>
+            <wp:docPr id="1" name="Image1"/>
+            <wp:cNvGraphicFramePr>
+              <a:graphicFrameLocks xmlns:a="http://schemas.openxmlformats.org/drawingml/2006/main" noChangeAspect="1"/>
+            </wp:cNvGraphicFramePr>
+            <a:graphic xmlns:a="http://schemas.openxmlformats.org/drawingml/2006/main">
+              <a:graphicData uri="http://schemas.openxmlformats.org/drawingml/2006/picture">
+                <pic:pic xmlns:pic="http://schemas.openxmlformats.org/drawingml/2006/picture">
+                  <pic:nvPicPr>
+                    <pic:cNvPr id="1" name="Image1"/>
+                    <pic:cNvPicPr>
+                      <a:picLocks noChangeAspect="1" noChangeArrowheads="1"/>
+                    </pic:cNvPicPr>
+                  </pic:nvPicPr>
+                  <pic:blipFill>
+                    <a:blip r:embed="rId2"/>
+                    <a:stretch>
+                      <a:fillRect/>
+                    </a:stretch>
+                  </pic:blipFill>
+                  <pic:spPr bwMode="auto">
+                    <a:xfrm>
+                      <a:off x="0" y="0"/>
+                      <a:ext cx="5943600" cy="1981200"/>
+                    </a:xfrm>
+                    <a:prstGeom prst="rect">
+                      <a:avLst/>
+                    </a:prstGeom>
+                    <a:noFill/>
+                  </pic:spPr>
+                </pic:pic>
+              </a:graphicData>
+            </a:graphic>
+          </wp:anchor>
+        </w:drawing>
+      </w:r>
+    </w:p>
+    <w:p>
+      <w:pPr>
+        <w:pStyle w:val="BodyText"/>
+        <w:rPr/>
+      </w:pPr>
+      <w:r>
+        <w:rPr/>
+      </w:r>
+    </w:p>
+    <w:p>
+      <w:pPr>
+        <w:pStyle w:val="BodyText"/>
+        <w:rPr/>
+      </w:pPr>
+      <w:r>
+        <w:rPr/>
+      </w:r>
+    </w:p>
+    <w:p>
+      <w:pPr>
+        <w:pStyle w:val="BodyText"/>
+        <w:rPr/>
+      </w:pPr>
+      <w:r>
+        <w:rPr/>
+      </w:r>
+    </w:p>
     <w:tbl>
       <w:tblPr>
         <w:tblStyle w:val="Table1"/>
@@ -119,16 +201,102 @@
     </w:tbl>
     <w:p>
       <w:pPr>
-        <w:pStyle w:val="normal1"/>
-        <w:spacing w:lineRule="auto" w:line="240" w:before="400" w:after="0"/>
-        <w:rPr>
-          <w:rFonts w:ascii="Ubuntu Sans Mono" w:hAnsi="Ubuntu Sans Mono"/>
-        </w:rPr>
+        <w:pStyle w:val="BodyText"/>
+        <w:rPr/>
       </w:pPr>
       <w:r>
-        <w:rPr>
-          <w:rFonts w:ascii="Ubuntu Sans Mono" w:hAnsi="Ubuntu Sans Mono"/>
-        </w:rPr>
+        <w:rPr/>
+      </w:r>
+    </w:p>
+    <w:p>
+      <w:pPr>
+        <w:pStyle w:val="BodyText"/>
+        <w:rPr/>
+      </w:pPr>
+      <w:r>
+        <w:rPr/>
+      </w:r>
+    </w:p>
+    <w:p>
+      <w:pPr>
+        <w:pStyle w:val="BodyText"/>
+        <w:rPr/>
+      </w:pPr>
+      <w:r>
+        <w:rPr/>
+      </w:r>
+    </w:p>
+    <w:p>
+      <w:pPr>
+        <w:pStyle w:val="BodyText"/>
+        <w:rPr/>
+      </w:pPr>
+      <w:r>
+        <w:rPr/>
+      </w:r>
+    </w:p>
+    <w:p>
+      <w:pPr>
+        <w:pStyle w:val="BodyText"/>
+        <w:rPr/>
+      </w:pPr>
+      <w:r>
+        <w:rPr/>
+        <w:t>Helen Samara Dos Santos (DA21051)</w:t>
+      </w:r>
+    </w:p>
+    <w:p>
+      <w:pPr>
+        <w:pStyle w:val="BodyText"/>
+        <w:rPr/>
+      </w:pPr>
+      <w:r>
+        <w:rPr/>
+      </w:r>
+    </w:p>
+    <w:p>
+      <w:pPr>
+        <w:pStyle w:val="BodyText"/>
+        <w:rPr/>
+      </w:pPr>
+      <w:r>
+        <w:rPr/>
+      </w:r>
+    </w:p>
+    <w:p>
+      <w:pPr>
+        <w:pStyle w:val="BodyText"/>
+        <w:rPr/>
+      </w:pPr>
+      <w:r>
+        <w:rPr/>
+      </w:r>
+    </w:p>
+    <w:p>
+      <w:pPr>
+        <w:pStyle w:val="BodyText"/>
+        <w:rPr/>
+      </w:pPr>
+      <w:r>
+        <w:rPr/>
+      </w:r>
+    </w:p>
+    <w:p>
+      <w:pPr>
+        <w:pStyle w:val="BodyText"/>
+        <w:rPr/>
+      </w:pPr>
+      <w:r>
+        <w:rPr/>
+      </w:r>
+    </w:p>
+    <w:p>
+      <w:pPr>
+        <w:pStyle w:val="BodyText"/>
+        <w:rPr/>
+      </w:pPr>
+      <w:r>
+        <w:rPr/>
       </w:r>
     </w:p>
     <w:tbl>
@@ -215,567 +383,6 @@
         </w:tc>
       </w:tr>
     </w:tbl>
-    <w:p>
-      <w:pPr>
-        <w:pStyle w:val="normal1"/>
-        <w:spacing w:lineRule="auto" w:line="240" w:before="200" w:after="0"/>
-        <w:rPr>
-          <w:rFonts w:ascii="Ubuntu Sans Mono" w:hAnsi="Ubuntu Sans Mono"/>
-        </w:rPr>
-      </w:pPr>
-      <w:r>
-        <w:rPr>
-          <w:rFonts w:ascii="Ubuntu Sans Mono" w:hAnsi="Ubuntu Sans Mono"/>
-        </w:rPr>
-      </w:r>
-    </w:p>
-    <w:p>
-      <w:pPr>
-        <w:pStyle w:val="Heading2"/>
-        <w:spacing w:lineRule="auto" w:line="240" w:before="240" w:after="120"/>
-        <w:rPr>
-          <w:rFonts w:ascii="Ubuntu Sans Mono" w:hAnsi="Ubuntu Sans Mono"/>
-        </w:rPr>
-      </w:pPr>
-      <w:r>
-        <w:rPr>
-          <w:rFonts w:eastAsia="Arial" w:cs="Arial" w:ascii="Ubuntu Sans Mono" w:hAnsi="Ubuntu Sans Mono"/>
-          <w:b/>
-          <w:bCs/>
-          <w:color w:val="2563EB"/>
-          <w:sz w:val="26"/>
-          <w:szCs w:val="26"/>
-        </w:rPr>
-        <w:t>Project file structure</w:t>
-      </w:r>
-    </w:p>
-    <w:p>
-      <w:pPr>
-        <w:pStyle w:val="normal1"/>
-        <w:spacing w:lineRule="auto" w:line="240" w:before="60" w:after="120"/>
-        <w:rPr>
-          <w:rFonts w:ascii="Ubuntu Sans Mono" w:hAnsi="Ubuntu Sans Mono"/>
-        </w:rPr>
-      </w:pPr>
-      <w:r>
-        <w:rPr>
-          <w:rFonts w:eastAsia="Arial" w:cs="Arial" w:ascii="Ubuntu Sans Mono" w:hAnsi="Ubuntu Sans Mono"/>
-          <w:color w:val="374151"/>
-          <w:sz w:val="22"/>
-          <w:szCs w:val="22"/>
-        </w:rPr>
-        <w:t>The project lives in a folder called Performance-Intelligence-Agent with this layout:</w:t>
-      </w:r>
-    </w:p>
-    <w:p>
-      <w:pPr>
-        <w:pStyle w:val="normal1"/>
-        <w:spacing w:lineRule="auto" w:line="240" w:before="80" w:after="0"/>
-        <w:rPr>
-          <w:rFonts w:ascii="Ubuntu Sans Mono" w:hAnsi="Ubuntu Sans Mono"/>
-        </w:rPr>
-      </w:pPr>
-      <w:r>
-        <w:rPr>
-          <w:rFonts w:ascii="Ubuntu Sans Mono" w:hAnsi="Ubuntu Sans Mono"/>
-        </w:rPr>
-      </w:r>
-    </w:p>
-    <w:p>
-      <w:pPr>
-        <w:pStyle w:val="normal1"/>
-        <w:spacing w:lineRule="auto" w:line="240" w:before="40" w:after="40"/>
-        <w:rPr>
-          <w:rFonts w:ascii="Ubuntu Sans Mono" w:hAnsi="Ubuntu Sans Mono"/>
-        </w:rPr>
-      </w:pPr>
-      <w:r>
-        <w:rPr>
-          <w:rFonts w:eastAsia="Courier New" w:cs="Courier New" w:ascii="Ubuntu Sans Mono" w:hAnsi="Ubuntu Sans Mono"/>
-          <w:color w:val="1D4ED8"/>
-          <w:sz w:val="19"/>
-          <w:szCs w:val="19"/>
-        </w:rPr>
-        <w:t>Performance-Intelligence-Agent/</w:t>
-      </w:r>
-    </w:p>
-    <w:p>
-      <w:pPr>
-        <w:pStyle w:val="normal1"/>
-        <w:spacing w:lineRule="auto" w:line="240" w:before="40" w:after="40"/>
-        <w:rPr>
-          <w:rFonts w:ascii="Ubuntu Sans Mono" w:hAnsi="Ubuntu Sans Mono"/>
-        </w:rPr>
-      </w:pPr>
-      <w:r>
-        <w:rPr>
-          <w:rFonts w:eastAsia="Courier New" w:cs="Courier New" w:ascii="Ubuntu Sans Mono" w:hAnsi="Ubuntu Sans Mono"/>
-          <w:color w:val="1D4ED8"/>
-          <w:sz w:val="19"/>
-          <w:szCs w:val="19"/>
-        </w:rPr>
-        <w:t xml:space="preserve">├── </w:t>
-      </w:r>
-      <w:r>
-        <w:rPr>
-          <w:rFonts w:eastAsia="Courier New" w:cs="Courier New" w:ascii="Ubuntu Sans Mono" w:hAnsi="Ubuntu Sans Mono"/>
-          <w:color w:val="1D4ED8"/>
-          <w:sz w:val="19"/>
-          <w:szCs w:val="19"/>
-        </w:rPr>
-        <w:t>data/</w:t>
-      </w:r>
-    </w:p>
-    <w:p>
-      <w:pPr>
-        <w:pStyle w:val="normal1"/>
-        <w:spacing w:lineRule="auto" w:line="240" w:before="40" w:after="40"/>
-        <w:rPr>
-          <w:rFonts w:ascii="Ubuntu Sans Mono" w:hAnsi="Ubuntu Sans Mono"/>
-        </w:rPr>
-      </w:pPr>
-      <w:r>
-        <w:rPr>
-          <w:rFonts w:eastAsia="Fira Mono" w:cs="Fira Mono" w:ascii="Ubuntu Sans Mono" w:hAnsi="Ubuntu Sans Mono"/>
-          <w:color w:val="1D4ED8"/>
-          <w:sz w:val="19"/>
-          <w:szCs w:val="19"/>
-        </w:rPr>
-        <w:t xml:space="preserve">│   └── </w:t>
-      </w:r>
-      <w:r>
-        <w:rPr>
-          <w:rFonts w:eastAsia="Fira Mono" w:cs="Fira Mono" w:ascii="Ubuntu Sans Mono" w:hAnsi="Ubuntu Sans Mono"/>
-          <w:color w:val="1D4ED8"/>
-          <w:sz w:val="19"/>
-          <w:szCs w:val="19"/>
-        </w:rPr>
-        <w:t>workouts.csv          ← SugarWOD export</w:t>
-      </w:r>
-    </w:p>
-    <w:p>
-      <w:pPr>
-        <w:pStyle w:val="normal1"/>
-        <w:spacing w:lineRule="auto" w:line="240" w:before="40" w:after="40"/>
-        <w:rPr>
-          <w:rFonts w:ascii="Ubuntu Sans Mono" w:hAnsi="Ubuntu Sans Mono"/>
-        </w:rPr>
-      </w:pPr>
-      <w:r>
-        <w:rPr>
-          <w:rFonts w:eastAsia="Courier New" w:cs="Courier New" w:ascii="Ubuntu Sans Mono" w:hAnsi="Ubuntu Sans Mono"/>
-          <w:color w:val="1D4ED8"/>
-          <w:sz w:val="19"/>
-          <w:szCs w:val="19"/>
-        </w:rPr>
-        <w:t xml:space="preserve">├── </w:t>
-      </w:r>
-      <w:r>
-        <w:rPr>
-          <w:rFonts w:eastAsia="Courier New" w:cs="Courier New" w:ascii="Ubuntu Sans Mono" w:hAnsi="Ubuntu Sans Mono"/>
-          <w:color w:val="1D4ED8"/>
-          <w:sz w:val="19"/>
-          <w:szCs w:val="19"/>
-        </w:rPr>
-        <w:t>analysis/</w:t>
-      </w:r>
-    </w:p>
-    <w:p>
-      <w:pPr>
-        <w:pStyle w:val="normal1"/>
-        <w:spacing w:lineRule="auto" w:line="240" w:before="40" w:after="40"/>
-        <w:rPr>
-          <w:rFonts w:ascii="Ubuntu Sans Mono" w:hAnsi="Ubuntu Sans Mono"/>
-        </w:rPr>
-      </w:pPr>
-      <w:r>
-        <w:rPr>
-          <w:rFonts w:eastAsia="Courier New" w:cs="Courier New" w:ascii="Ubuntu Sans Mono" w:hAnsi="Ubuntu Sans Mono"/>
-          <w:color w:val="1D4ED8"/>
-          <w:sz w:val="19"/>
-          <w:szCs w:val="19"/>
-        </w:rPr>
-        <w:t xml:space="preserve">│  ├── </w:t>
-      </w:r>
-      <w:r>
-        <w:rPr>
-          <w:rFonts w:eastAsia="Courier New" w:cs="Courier New" w:ascii="Ubuntu Sans Mono" w:hAnsi="Ubuntu Sans Mono"/>
-          <w:color w:val="1D4ED8"/>
-          <w:sz w:val="19"/>
-          <w:szCs w:val="19"/>
-        </w:rPr>
-        <w:t>__init__.py</w:t>
-      </w:r>
-    </w:p>
-    <w:p>
-      <w:pPr>
-        <w:pStyle w:val="normal1"/>
-        <w:spacing w:lineRule="auto" w:line="240" w:before="40" w:after="40"/>
-        <w:rPr>
-          <w:rFonts w:ascii="Ubuntu Sans Mono" w:hAnsi="Ubuntu Sans Mono"/>
-        </w:rPr>
-      </w:pPr>
-      <w:r>
-        <w:rPr>
-          <w:rFonts w:eastAsia="Fira Mono" w:cs="Fira Mono" w:ascii="Ubuntu Sans Mono" w:hAnsi="Ubuntu Sans Mono"/>
-          <w:color w:val="1D4ED8"/>
-          <w:sz w:val="19"/>
-          <w:szCs w:val="19"/>
-        </w:rPr>
-        <w:t xml:space="preserve">│    ├── </w:t>
-      </w:r>
-      <w:r>
-        <w:rPr>
-          <w:rFonts w:eastAsia="Fira Mono" w:cs="Fira Mono" w:ascii="Ubuntu Sans Mono" w:hAnsi="Ubuntu Sans Mono"/>
-          <w:color w:val="1D4ED8"/>
-          <w:sz w:val="19"/>
-          <w:szCs w:val="19"/>
-        </w:rPr>
-        <w:t>attendance.py         ← monthly/weekly charts, gap detection</w:t>
-      </w:r>
-    </w:p>
-    <w:p>
-      <w:pPr>
-        <w:pStyle w:val="normal1"/>
-        <w:spacing w:lineRule="auto" w:line="240" w:before="40" w:after="40"/>
-        <w:rPr>
-          <w:rFonts w:ascii="Ubuntu Sans Mono" w:hAnsi="Ubuntu Sans Mono"/>
-        </w:rPr>
-      </w:pPr>
-      <w:r>
-        <w:rPr>
-          <w:rFonts w:eastAsia="Fira Mono" w:cs="Fira Mono" w:ascii="Ubuntu Sans Mono" w:hAnsi="Ubuntu Sans Mono"/>
-          <w:color w:val="1D4ED8"/>
-          <w:sz w:val="19"/>
-          <w:szCs w:val="19"/>
-        </w:rPr>
-        <w:t xml:space="preserve">│    ├── </w:t>
-      </w:r>
-      <w:r>
-        <w:rPr>
-          <w:rFonts w:eastAsia="Fira Mono" w:cs="Fira Mono" w:ascii="Ubuntu Sans Mono" w:hAnsi="Ubuntu Sans Mono"/>
-          <w:color w:val="1D4ED8"/>
-          <w:sz w:val="19"/>
-          <w:szCs w:val="19"/>
-        </w:rPr>
-        <w:t>sentiment.py          ← keyword scoring, word frequency, vs-RX</w:t>
-      </w:r>
-    </w:p>
-    <w:p>
-      <w:pPr>
-        <w:pStyle w:val="normal1"/>
-        <w:spacing w:lineRule="auto" w:line="240" w:before="40" w:after="40"/>
-        <w:rPr>
-          <w:rFonts w:ascii="Ubuntu Sans Mono" w:hAnsi="Ubuntu Sans Mono"/>
-        </w:rPr>
-      </w:pPr>
-      <w:r>
-        <w:rPr>
-          <w:rFonts w:eastAsia="Fira Mono" w:cs="Fira Mono" w:ascii="Ubuntu Sans Mono" w:hAnsi="Ubuntu Sans Mono"/>
-          <w:color w:val="1D4ED8"/>
-          <w:sz w:val="19"/>
-          <w:szCs w:val="19"/>
-        </w:rPr>
-        <w:t xml:space="preserve">│    ├── </w:t>
-      </w:r>
-      <w:r>
-        <w:rPr>
-          <w:rFonts w:eastAsia="Fira Mono" w:cs="Fira Mono" w:ascii="Ubuntu Sans Mono" w:hAnsi="Ubuntu Sans Mono"/>
-          <w:color w:val="1D4ED8"/>
-          <w:sz w:val="19"/>
-          <w:szCs w:val="19"/>
-        </w:rPr>
-        <w:t>performance.py        ← RX rate, strength, lift heatmap, PRs</w:t>
-      </w:r>
-    </w:p>
-    <w:p>
-      <w:pPr>
-        <w:pStyle w:val="normal1"/>
-        <w:spacing w:lineRule="auto" w:line="240" w:before="40" w:after="40"/>
-        <w:rPr>
-          <w:rFonts w:ascii="Ubuntu Sans Mono" w:hAnsi="Ubuntu Sans Mono"/>
-        </w:rPr>
-      </w:pPr>
-      <w:r>
-        <w:rPr>
-          <w:rFonts w:eastAsia="Fira Mono" w:cs="Fira Mono" w:ascii="Ubuntu Sans Mono" w:hAnsi="Ubuntu Sans Mono"/>
-          <w:color w:val="1D4ED8"/>
-          <w:sz w:val="19"/>
-          <w:szCs w:val="19"/>
-        </w:rPr>
-        <w:t xml:space="preserve">│    └── </w:t>
-      </w:r>
-      <w:r>
-        <w:rPr>
-          <w:rFonts w:eastAsia="Fira Mono" w:cs="Fira Mono" w:ascii="Ubuntu Sans Mono" w:hAnsi="Ubuntu Sans Mono"/>
-          <w:color w:val="1D4ED8"/>
-          <w:sz w:val="19"/>
-          <w:szCs w:val="19"/>
-        </w:rPr>
-        <w:t>ml_models.py          ← KMeans, Isolation Forest, Linear Regression</w:t>
-      </w:r>
-    </w:p>
-    <w:p>
-      <w:pPr>
-        <w:pStyle w:val="normal1"/>
-        <w:spacing w:lineRule="auto" w:line="240" w:before="40" w:after="40"/>
-        <w:rPr>
-          <w:rFonts w:ascii="Ubuntu Sans Mono" w:hAnsi="Ubuntu Sans Mono"/>
-        </w:rPr>
-      </w:pPr>
-      <w:r>
-        <w:rPr>
-          <w:rFonts w:eastAsia="Fira Mono" w:cs="Fira Mono" w:ascii="Ubuntu Sans Mono" w:hAnsi="Ubuntu Sans Mono"/>
-          <w:color w:val="1D4ED8"/>
-          <w:sz w:val="19"/>
-          <w:szCs w:val="19"/>
-        </w:rPr>
-        <w:t xml:space="preserve">├── </w:t>
-      </w:r>
-      <w:r>
-        <w:rPr>
-          <w:rFonts w:eastAsia="Fira Mono" w:cs="Fira Mono" w:ascii="Ubuntu Sans Mono" w:hAnsi="Ubuntu Sans Mono"/>
-          <w:color w:val="1D4ED8"/>
-          <w:sz w:val="19"/>
-          <w:szCs w:val="19"/>
-        </w:rPr>
-        <w:t>loader.py                 ← single source of data loading &amp; cleaning</w:t>
-      </w:r>
-    </w:p>
-    <w:p>
-      <w:pPr>
-        <w:pStyle w:val="normal1"/>
-        <w:spacing w:lineRule="auto" w:line="240" w:before="40" w:after="40"/>
-        <w:rPr>
-          <w:rFonts w:ascii="Ubuntu Sans Mono" w:hAnsi="Ubuntu Sans Mono"/>
-        </w:rPr>
-      </w:pPr>
-      <w:r>
-        <w:rPr>
-          <w:rFonts w:eastAsia="Fira Mono" w:cs="Fira Mono" w:ascii="Ubuntu Sans Mono" w:hAnsi="Ubuntu Sans Mono"/>
-          <w:color w:val="1D4ED8"/>
-          <w:sz w:val="19"/>
-          <w:szCs w:val="19"/>
-        </w:rPr>
-        <w:t xml:space="preserve">├── </w:t>
-      </w:r>
-      <w:r>
-        <w:rPr>
-          <w:rFonts w:eastAsia="Fira Mono" w:cs="Fira Mono" w:ascii="Ubuntu Sans Mono" w:hAnsi="Ubuntu Sans Mono"/>
-          <w:color w:val="1D4ED8"/>
-          <w:sz w:val="19"/>
-          <w:szCs w:val="19"/>
-        </w:rPr>
-        <w:t>tools.py                  ← wraps analysis as Claude agent tools</w:t>
-      </w:r>
-    </w:p>
-    <w:p>
-      <w:pPr>
-        <w:pStyle w:val="normal1"/>
-        <w:spacing w:lineRule="auto" w:line="240" w:before="40" w:after="40"/>
-        <w:rPr>
-          <w:rFonts w:ascii="Ubuntu Sans Mono" w:hAnsi="Ubuntu Sans Mono"/>
-        </w:rPr>
-      </w:pPr>
-      <w:r>
-        <w:rPr>
-          <w:rFonts w:eastAsia="Fira Mono" w:cs="Fira Mono" w:ascii="Ubuntu Sans Mono" w:hAnsi="Ubuntu Sans Mono"/>
-          <w:color w:val="1D4ED8"/>
-          <w:sz w:val="19"/>
-          <w:szCs w:val="19"/>
-        </w:rPr>
-        <w:t xml:space="preserve">├── </w:t>
-      </w:r>
-      <w:r>
-        <w:rPr>
-          <w:rFonts w:eastAsia="Fira Mono" w:cs="Fira Mono" w:ascii="Ubuntu Sans Mono" w:hAnsi="Ubuntu Sans Mono"/>
-          <w:color w:val="1D4ED8"/>
-          <w:sz w:val="19"/>
-          <w:szCs w:val="19"/>
-        </w:rPr>
-        <w:t>agent.py                  ← Claude tool-use loop (Anthropic API)</w:t>
-      </w:r>
-    </w:p>
-    <w:p>
-      <w:pPr>
-        <w:pStyle w:val="normal1"/>
-        <w:spacing w:lineRule="auto" w:line="240" w:before="40" w:after="40"/>
-        <w:rPr>
-          <w:rFonts w:ascii="Ubuntu Sans Mono" w:hAnsi="Ubuntu Sans Mono"/>
-        </w:rPr>
-      </w:pPr>
-      <w:r>
-        <w:rPr>
-          <w:rFonts w:eastAsia="Fira Mono" w:cs="Fira Mono" w:ascii="Ubuntu Sans Mono" w:hAnsi="Ubuntu Sans Mono"/>
-          <w:color w:val="1D4ED8"/>
-          <w:sz w:val="19"/>
-          <w:szCs w:val="19"/>
-        </w:rPr>
-        <w:t xml:space="preserve">├── </w:t>
-      </w:r>
-      <w:r>
-        <w:rPr>
-          <w:rFonts w:eastAsia="Fira Mono" w:cs="Fira Mono" w:ascii="Ubuntu Sans Mono" w:hAnsi="Ubuntu Sans Mono"/>
-          <w:color w:val="1D4ED8"/>
-          <w:sz w:val="19"/>
-          <w:szCs w:val="19"/>
-        </w:rPr>
-        <w:t>app.py                    ← Streamlit chat interface</w:t>
-      </w:r>
-    </w:p>
-    <w:p>
-      <w:pPr>
-        <w:pStyle w:val="normal1"/>
-        <w:spacing w:lineRule="auto" w:line="240" w:before="40" w:after="40"/>
-        <w:rPr>
-          <w:rFonts w:ascii="Ubuntu Sans Mono" w:hAnsi="Ubuntu Sans Mono"/>
-        </w:rPr>
-      </w:pPr>
-      <w:r>
-        <w:rPr>
-          <w:rFonts w:eastAsia="Courier New" w:cs="Courier New" w:ascii="Ubuntu Sans Mono" w:hAnsi="Ubuntu Sans Mono"/>
-          <w:color w:val="1D4ED8"/>
-          <w:sz w:val="19"/>
-          <w:szCs w:val="19"/>
-        </w:rPr>
-        <w:t xml:space="preserve">├── </w:t>
-      </w:r>
-      <w:r>
-        <w:rPr>
-          <w:rFonts w:eastAsia="Courier New" w:cs="Courier New" w:ascii="Ubuntu Sans Mono" w:hAnsi="Ubuntu Sans Mono"/>
-          <w:color w:val="1D4ED8"/>
-          <w:sz w:val="19"/>
-          <w:szCs w:val="19"/>
-        </w:rPr>
-        <w:t>requirements.txt</w:t>
-      </w:r>
-    </w:p>
-    <w:p>
-      <w:pPr>
-        <w:pStyle w:val="normal1"/>
-        <w:spacing w:lineRule="auto" w:line="240" w:before="40" w:after="40"/>
-        <w:rPr>
-          <w:rFonts w:ascii="Ubuntu Sans Mono" w:hAnsi="Ubuntu Sans Mono"/>
-        </w:rPr>
-      </w:pPr>
-      <w:r>
-        <w:rPr>
-          <w:rFonts w:eastAsia="Courier New" w:cs="Courier New" w:ascii="Ubuntu Sans Mono" w:hAnsi="Ubuntu Sans Mono"/>
-          <w:color w:val="1D4ED8"/>
-          <w:sz w:val="19"/>
-          <w:szCs w:val="19"/>
-        </w:rPr>
-        <w:t xml:space="preserve">├── </w:t>
-      </w:r>
-      <w:r>
-        <w:rPr>
-          <w:rFonts w:eastAsia="Courier New" w:cs="Courier New" w:ascii="Ubuntu Sans Mono" w:hAnsi="Ubuntu Sans Mono"/>
-          <w:color w:val="1D4ED8"/>
-          <w:sz w:val="19"/>
-          <w:szCs w:val="19"/>
-        </w:rPr>
-        <w:t>README.md</w:t>
-      </w:r>
-    </w:p>
-    <w:p>
-      <w:pPr>
-        <w:pStyle w:val="normal1"/>
-        <w:spacing w:lineRule="auto" w:line="240" w:before="40" w:after="40"/>
-        <w:rPr>
-          <w:rFonts w:ascii="Ubuntu Sans Mono" w:hAnsi="Ubuntu Sans Mono"/>
-        </w:rPr>
-      </w:pPr>
-      <w:r>
-        <w:rPr>
-          <w:rFonts w:eastAsia="Courier New" w:cs="Courier New" w:ascii="Ubuntu Sans Mono" w:hAnsi="Ubuntu Sans Mono"/>
-          <w:color w:val="1D4ED8"/>
-          <w:sz w:val="19"/>
-          <w:szCs w:val="19"/>
-        </w:rPr>
-        <w:t xml:space="preserve">└── </w:t>
-      </w:r>
-      <w:r>
-        <w:rPr>
-          <w:rFonts w:eastAsia="Courier New" w:cs="Courier New" w:ascii="Ubuntu Sans Mono" w:hAnsi="Ubuntu Sans Mono"/>
-          <w:color w:val="1D4ED8"/>
-          <w:sz w:val="19"/>
-          <w:szCs w:val="19"/>
-        </w:rPr>
-        <w:t>.gitignore</w:t>
-      </w:r>
-    </w:p>
-    <w:p>
-      <w:pPr>
-        <w:pStyle w:val="normal1"/>
-        <w:spacing w:lineRule="auto" w:line="240" w:before="160" w:after="0"/>
-        <w:rPr>
-          <w:rFonts w:ascii="Ubuntu Sans Mono" w:hAnsi="Ubuntu Sans Mono"/>
-        </w:rPr>
-      </w:pPr>
-      <w:r>
-        <w:rPr>
-          <w:rFonts w:ascii="Ubuntu Sans Mono" w:hAnsi="Ubuntu Sans Mono"/>
-        </w:rPr>
-      </w:r>
-    </w:p>
-    <w:p>
-      <w:pPr>
-        <w:pStyle w:val="Heading2"/>
-        <w:spacing w:lineRule="auto" w:line="240" w:before="240" w:after="120"/>
-        <w:rPr>
-          <w:rFonts w:ascii="Ubuntu Sans Mono" w:hAnsi="Ubuntu Sans Mono"/>
-        </w:rPr>
-      </w:pPr>
-      <w:r>
-        <w:rPr>
-          <w:rFonts w:ascii="Ubuntu Sans Mono" w:hAnsi="Ubuntu Sans Mono"/>
-        </w:rPr>
-      </w:r>
-    </w:p>
-    <w:p>
-      <w:pPr>
-        <w:pStyle w:val="Heading2"/>
-        <w:spacing w:lineRule="auto" w:line="240" w:before="240" w:after="120"/>
-        <w:rPr>
-          <w:rFonts w:ascii="Ubuntu Sans Mono" w:hAnsi="Ubuntu Sans Mono" w:eastAsia="Arial" w:cs="Arial"/>
-          <w:b/>
-          <w:bCs/>
-          <w:color w:val="2563EB"/>
-          <w:sz w:val="26"/>
-          <w:szCs w:val="26"/>
-        </w:rPr>
-      </w:pPr>
-      <w:r>
-        <w:rPr>
-          <w:rFonts w:eastAsia="Arial" w:cs="Arial" w:ascii="Ubuntu Sans Mono" w:hAnsi="Ubuntu Sans Mono"/>
-          <w:b/>
-          <w:bCs/>
-          <w:color w:val="2563EB"/>
-          <w:sz w:val="26"/>
-          <w:szCs w:val="26"/>
-        </w:rPr>
-      </w:r>
-    </w:p>
-    <w:p>
-      <w:pPr>
-        <w:pStyle w:val="Heading2"/>
-        <w:spacing w:lineRule="auto" w:line="240" w:before="240" w:after="120"/>
-        <w:rPr>
-          <w:rFonts w:ascii="Ubuntu Sans Mono" w:hAnsi="Ubuntu Sans Mono"/>
-        </w:rPr>
-      </w:pPr>
-      <w:r>
-        <w:rPr>
-          <w:rFonts w:eastAsia="Arial" w:cs="Arial" w:ascii="Ubuntu Sans Mono" w:hAnsi="Ubuntu Sans Mono"/>
-          <w:b/>
-          <w:bCs/>
-          <w:color w:val="2563EB"/>
-          <w:sz w:val="26"/>
-          <w:szCs w:val="26"/>
-        </w:rPr>
-        <w:t>What each file does</w:t>
-      </w:r>
-    </w:p>
     <w:tbl>
       <w:tblPr>
         <w:tblStyle w:val="Table3"/>
@@ -1397,36 +1004,6 @@
         </w:tc>
       </w:tr>
     </w:tbl>
-    <w:p>
-      <w:pPr>
-        <w:pStyle w:val="normal1"/>
-        <w:spacing w:lineRule="auto" w:line="240" w:before="300" w:after="0"/>
-        <w:rPr>
-          <w:rFonts w:ascii="Ubuntu Sans Mono" w:hAnsi="Ubuntu Sans Mono"/>
-        </w:rPr>
-      </w:pPr>
-      <w:r>
-        <w:rPr>
-          <w:rFonts w:ascii="Ubuntu Sans Mono" w:hAnsi="Ubuntu Sans Mono"/>
-        </w:rPr>
-      </w:r>
-    </w:p>
-    <w:p>
-      <w:pPr>
-        <w:pStyle w:val="normal1"/>
-        <w:rPr>
-          <w:rFonts w:ascii="Ubuntu Sans Mono" w:hAnsi="Ubuntu Sans Mono"/>
-        </w:rPr>
-      </w:pPr>
-      <w:r>
-        <w:rPr>
-          <w:rFonts w:ascii="Ubuntu Sans Mono" w:hAnsi="Ubuntu Sans Mono"/>
-        </w:rPr>
-      </w:r>
-      <w:r>
-        <w:br w:type="page"/>
-      </w:r>
-    </w:p>
     <w:tbl>
       <w:tblPr>
         <w:tblStyle w:val="Table4"/>
@@ -1463,6 +1040,9 @@
               </w:rPr>
             </w:pPr>
             <w:r>
+              <w:br w:type="page"/>
+            </w:r>
+            <w:r>
               <w:rPr>
                 <w:rFonts w:eastAsia="Arial" w:cs="Arial" w:ascii="Ubuntu Sans Mono" w:hAnsi="Ubuntu Sans Mono"/>
                 <w:b/>
@@ -1553,20 +1133,6 @@
         </w:tc>
       </w:tr>
     </w:tbl>
-    <w:p>
-      <w:pPr>
-        <w:pStyle w:val="normal1"/>
-        <w:spacing w:lineRule="auto" w:line="240" w:before="200" w:after="0"/>
-        <w:rPr>
-          <w:rFonts w:ascii="Ubuntu Sans Mono" w:hAnsi="Ubuntu Sans Mono"/>
-        </w:rPr>
-      </w:pPr>
-      <w:r>
-        <w:rPr>
-          <w:rFonts w:ascii="Ubuntu Sans Mono" w:hAnsi="Ubuntu Sans Mono"/>
-        </w:rPr>
-      </w:r>
-    </w:p>
     <w:tbl>
       <w:tblPr>
         <w:tblStyle w:val="Table5"/>
@@ -1961,25 +1527,7 @@
                 <w:sz w:val="22"/>
                 <w:szCs w:val="22"/>
               </w:rPr>
-              <w:t xml:space="preserve">October 2024 </w:t>
-            </w:r>
-            <w:r>
-              <w:rPr>
-                <w:rFonts w:eastAsia="Arial" w:cs="Arial" w:ascii="Ubuntu Sans Mono" w:hAnsi="Ubuntu Sans Mono"/>
-                <w:color w:val="374151"/>
-                <w:sz w:val="22"/>
-                <w:szCs w:val="22"/>
-              </w:rPr>
-              <w:t>with</w:t>
-            </w:r>
-            <w:r>
-              <w:rPr>
-                <w:rFonts w:eastAsia="Arial" w:cs="Arial" w:ascii="Ubuntu Sans Mono" w:hAnsi="Ubuntu Sans Mono"/>
-                <w:color w:val="374151"/>
-                <w:sz w:val="22"/>
-                <w:szCs w:val="22"/>
-              </w:rPr>
-              <w:t xml:space="preserve"> 34 sessions</w:t>
+              <w:t>October 2024 with 34 sessions</w:t>
             </w:r>
           </w:p>
         </w:tc>
@@ -2049,21 +1597,7 @@
                 <w:rFonts w:ascii="Ubuntu Sans Mono" w:hAnsi="Ubuntu Sans Mono"/>
                 <w:color w:val="374151"/>
               </w:rPr>
-              <w:t xml:space="preserve">ry </w:t>
-            </w:r>
-            <w:r>
-              <w:rPr>
-                <w:rFonts w:ascii="Ubuntu Sans Mono" w:hAnsi="Ubuntu Sans Mono"/>
-                <w:color w:val="374151"/>
-              </w:rPr>
-              <w:t>trying to max my DL</w:t>
-            </w:r>
-            <w:r>
-              <w:rPr>
-                <w:rFonts w:ascii="Ubuntu Sans Mono" w:hAnsi="Ubuntu Sans Mono"/>
-                <w:color w:val="374151"/>
-              </w:rPr>
-              <w:t>)</w:t>
+              <w:t>ry trying to max my DL)</w:t>
             </w:r>
           </w:p>
         </w:tc>
@@ -2126,46 +1660,14 @@
                 <w:sz w:val="22"/>
                 <w:szCs w:val="22"/>
               </w:rPr>
-              <w:t xml:space="preserve">+0.55 (positive). Correlation with RX rate: r = -0.16 (weak! </w:t>
-            </w:r>
-            <w:r>
-              <w:rPr>
-                <w:rFonts w:eastAsia="Arial" w:cs="Arial" w:ascii="Ubuntu Sans Mono" w:hAnsi="Ubuntu Sans Mono"/>
+              <w:t xml:space="preserve">+0.55 (positive). Correlation with RX rate: r = -0.16 (weak! That’s surprising. </w:t>
+            </w:r>
+            <w:r>
+              <w:rPr>
+                <w:rFonts w:ascii="Ubuntu Sans Mono" w:hAnsi="Ubuntu Sans Mono"/>
                 <w:color w:val="374151"/>
-                <w:sz w:val="22"/>
-                <w:szCs w:val="22"/>
-              </w:rPr>
-              <w:t xml:space="preserve">That’s </w:t>
-            </w:r>
-            <w:r>
-              <w:rPr>
-                <w:rFonts w:eastAsia="Arial" w:cs="Arial" w:ascii="Ubuntu Sans Mono" w:hAnsi="Ubuntu Sans Mono"/>
-                <w:color w:val="374151"/>
-                <w:sz w:val="22"/>
-                <w:szCs w:val="22"/>
-              </w:rPr>
-              <w:t xml:space="preserve">surprising. </w:t>
-            </w:r>
-            <w:r>
-              <w:rPr>
-                <w:rFonts w:ascii="Ubuntu Sans Mono" w:hAnsi="Ubuntu Sans Mono"/>
-                <w:color w:val="374151"/>
-              </w:rPr>
-              <w:t xml:space="preserve">I am enjoying showing up more </w:t>
-            </w:r>
-            <w:r>
-              <w:rPr>
-                <w:rFonts w:ascii="Ubuntu Sans Mono" w:hAnsi="Ubuntu Sans Mono"/>
-                <w:color w:val="374151"/>
-              </w:rPr>
-              <w:t>even though performance is far from where I would like it to be</w:t>
-            </w:r>
-            <w:r>
-              <w:rPr>
-                <w:rFonts w:ascii="Ubuntu Sans Mono" w:hAnsi="Ubuntu Sans Mono"/>
-                <w:color w:val="374151"/>
-              </w:rPr>
-              <w:t>!)</w:t>
+              </w:rPr>
+              <w:t>I am enjoying showing up more even though performance is far from where I would like it to be!)</w:t>
             </w:r>
           </w:p>
         </w:tc>
@@ -2417,72 +1919,19 @@
                 <w:sz w:val="22"/>
                 <w:szCs w:val="22"/>
               </w:rPr>
-              <w:t>Power Snatch ~10 days · Clean &amp; Jerk ~31 days · Snatch ~43 days (</w:t>
-            </w:r>
-            <w:r>
-              <w:rPr>
-                <w:rFonts w:eastAsia="Arial" w:cs="Arial" w:ascii="Ubuntu Sans Mono" w:hAnsi="Ubuntu Sans Mono"/>
+              <w:t>Power Snatch ~10 days · Clean &amp; Jerk ~31 days · Snatch ~43 days (Funny result!</w:t>
+            </w:r>
+            <w:r>
+              <w:rPr>
+                <w:rFonts w:ascii="Ubuntu Sans Mono" w:hAnsi="Ubuntu Sans Mono"/>
                 <w:color w:val="374151"/>
-                <w:sz w:val="22"/>
-                <w:szCs w:val="22"/>
-              </w:rPr>
-              <w:t>Funny result!</w:t>
-            </w:r>
-            <w:r>
-              <w:rPr>
-                <w:rFonts w:ascii="Ubuntu Sans Mono" w:hAnsi="Ubuntu Sans Mono"/>
-                <w:color w:val="374151"/>
-              </w:rPr>
-              <w:t xml:space="preserve"> </w:t>
-            </w:r>
-            <w:r>
-              <w:rPr>
-                <w:rFonts w:ascii="Ubuntu Sans Mono" w:hAnsi="Ubuntu Sans Mono"/>
-                <w:color w:val="374151"/>
-              </w:rPr>
-              <w:t>I have to add data from my health and powerlifting to have a better prediction</w:t>
-            </w:r>
-            <w:r>
-              <w:rPr>
-                <w:rFonts w:ascii="Ubuntu Sans Mono" w:hAnsi="Ubuntu Sans Mono"/>
-                <w:color w:val="374151"/>
-              </w:rPr>
-              <w:t>)</w:t>
+              </w:rPr>
+              <w:t xml:space="preserve"> I have to add data from my health and powerlifting to have a better prediction)</w:t>
             </w:r>
           </w:p>
         </w:tc>
       </w:tr>
     </w:tbl>
-    <w:p>
-      <w:pPr>
-        <w:pStyle w:val="normal1"/>
-        <w:spacing w:lineRule="auto" w:line="240" w:before="300" w:after="0"/>
-        <w:rPr>
-          <w:rFonts w:ascii="Ubuntu Sans Mono" w:hAnsi="Ubuntu Sans Mono"/>
-        </w:rPr>
-      </w:pPr>
-      <w:r>
-        <w:rPr>
-          <w:rFonts w:ascii="Ubuntu Sans Mono" w:hAnsi="Ubuntu Sans Mono"/>
-        </w:rPr>
-      </w:r>
-    </w:p>
-    <w:p>
-      <w:pPr>
-        <w:pStyle w:val="normal1"/>
-        <w:rPr>
-          <w:rFonts w:ascii="Ubuntu Sans Mono" w:hAnsi="Ubuntu Sans Mono"/>
-        </w:rPr>
-      </w:pPr>
-      <w:r>
-        <w:rPr>
-          <w:rFonts w:ascii="Ubuntu Sans Mono" w:hAnsi="Ubuntu Sans Mono"/>
-        </w:rPr>
-      </w:r>
-      <w:r>
-        <w:br w:type="page"/>
-      </w:r>
-    </w:p>
     <w:tbl>
       <w:tblPr>
         <w:tblStyle w:val="Table6"/>
@@ -2519,6 +1968,9 @@
               </w:rPr>
             </w:pPr>
             <w:r>
+              <w:br w:type="page"/>
+            </w:r>
+            <w:r>
               <w:rPr>
                 <w:rFonts w:eastAsia="Arial" w:cs="Arial" w:ascii="Ubuntu Sans Mono" w:hAnsi="Ubuntu Sans Mono"/>
                 <w:b/>
@@ -2551,20 +2003,6 @@
         </w:tc>
       </w:tr>
     </w:tbl>
-    <w:p>
-      <w:pPr>
-        <w:pStyle w:val="normal1"/>
-        <w:spacing w:lineRule="auto" w:line="240" w:before="200" w:after="0"/>
-        <w:rPr>
-          <w:rFonts w:ascii="Ubuntu Sans Mono" w:hAnsi="Ubuntu Sans Mono"/>
-        </w:rPr>
-      </w:pPr>
-      <w:r>
-        <w:rPr>
-          <w:rFonts w:ascii="Ubuntu Sans Mono" w:hAnsi="Ubuntu Sans Mono"/>
-        </w:rPr>
-      </w:r>
-    </w:p>
     <w:tbl>
       <w:tblPr>
         <w:tblStyle w:val="Table7"/>
@@ -2633,6 +2071,24 @@
               <w:t>The regex extracts explicit weight mentions from notes ("55 lbs") but misses implicit references. Fix: replace regex with a Claude extraction call that reads each note and returns structured weight data.</w:t>
             </w:r>
           </w:p>
+          <w:p>
+            <w:pPr>
+              <w:pStyle w:val="normal1"/>
+              <w:spacing w:lineRule="auto" w:line="240" w:before="60" w:after="0"/>
+              <w:rPr>
+                <w:rFonts w:ascii="Ubuntu Sans Mono" w:hAnsi="Ubuntu Sans Mono"/>
+              </w:rPr>
+            </w:pPr>
+            <w:r>
+              <w:rPr>
+                <w:rFonts w:eastAsia="Arial" w:cs="Arial" w:ascii="Ubuntu Sans Mono" w:hAnsi="Ubuntu Sans Mono"/>
+                <w:color w:val="374151"/>
+                <w:sz w:val="22"/>
+                <w:szCs w:val="22"/>
+              </w:rPr>
+              <w:t>THIS WAS  UPDATED</w:t>
+            </w:r>
+          </w:p>
         </w:tc>
       </w:tr>
       <w:tr>
@@ -2685,6 +2141,24 @@
               <w:t>best_result_raw means different things per score_type: seconds (timed), decimal rounds+reps (AMRAP), lbs (Load). Currently only Load sessions use the raw score numerically for ML. Timed and AMRAP scores need type-aware parsing before they can be trended.</w:t>
             </w:r>
           </w:p>
+          <w:p>
+            <w:pPr>
+              <w:pStyle w:val="normal1"/>
+              <w:spacing w:lineRule="auto" w:line="240" w:before="60" w:after="0"/>
+              <w:rPr>
+                <w:rFonts w:ascii="Ubuntu Sans Mono" w:hAnsi="Ubuntu Sans Mono"/>
+              </w:rPr>
+            </w:pPr>
+            <w:r>
+              <w:rPr>
+                <w:rFonts w:eastAsia="Arial" w:cs="Arial" w:ascii="Ubuntu Sans Mono" w:hAnsi="Ubuntu Sans Mono"/>
+                <w:color w:val="374151"/>
+                <w:sz w:val="22"/>
+                <w:szCs w:val="22"/>
+              </w:rPr>
+              <w:t>THIS WAS UPDATED</w:t>
+            </w:r>
+          </w:p>
         </w:tc>
       </w:tr>
       <w:tr>
@@ -2737,6 +2211,24 @@
               <w:t>Charts re-render on every interaction. Fix: add @st.cache_data to load_sugarwod() in app.py. This is a quick one-liner fix.</w:t>
             </w:r>
           </w:p>
+          <w:p>
+            <w:pPr>
+              <w:pStyle w:val="normal1"/>
+              <w:spacing w:lineRule="auto" w:line="240" w:before="60" w:after="0"/>
+              <w:rPr>
+                <w:rFonts w:ascii="Ubuntu Sans Mono" w:hAnsi="Ubuntu Sans Mono"/>
+              </w:rPr>
+            </w:pPr>
+            <w:r>
+              <w:rPr>
+                <w:rFonts w:eastAsia="Arial" w:cs="Arial" w:ascii="Ubuntu Sans Mono" w:hAnsi="Ubuntu Sans Mono"/>
+                <w:color w:val="374151"/>
+                <w:sz w:val="22"/>
+                <w:szCs w:val="22"/>
+              </w:rPr>
+              <w:t>THIS WAS UPDATED</w:t>
+            </w:r>
+          </w:p>
         </w:tc>
       </w:tr>
       <w:tr>
@@ -2805,6 +2297,24 @@
               <w:t xml:space="preserve"> consistently improving. As training matures and plateaus occur, a block-aware model (fitting per training cycle) will be more accurate.</w:t>
             </w:r>
           </w:p>
+          <w:p>
+            <w:pPr>
+              <w:pStyle w:val="normal1"/>
+              <w:spacing w:lineRule="auto" w:line="240" w:before="60" w:after="0"/>
+              <w:rPr>
+                <w:rFonts w:ascii="Ubuntu Sans Mono" w:hAnsi="Ubuntu Sans Mono"/>
+              </w:rPr>
+            </w:pPr>
+            <w:r>
+              <w:rPr>
+                <w:rFonts w:eastAsia="Arial" w:cs="Arial" w:ascii="Ubuntu Sans Mono" w:hAnsi="Ubuntu Sans Mono"/>
+                <w:color w:val="374151"/>
+                <w:sz w:val="22"/>
+                <w:szCs w:val="22"/>
+              </w:rPr>
+              <w:t>THIS WAS UPDATED</w:t>
+            </w:r>
+          </w:p>
         </w:tc>
       </w:tr>
       <w:tr>
@@ -2857,6 +2367,24 @@
               <w:t>The gap is real (not a data error). Any attendance or trend chart that spans this period will show a misleading drop. Consider flagging this explicitly in chart annotations or splitting pre/post gap analysis.</w:t>
             </w:r>
           </w:p>
+          <w:p>
+            <w:pPr>
+              <w:pStyle w:val="normal1"/>
+              <w:spacing w:lineRule="auto" w:line="240" w:before="60" w:after="0"/>
+              <w:rPr>
+                <w:rFonts w:ascii="Ubuntu Sans Mono" w:hAnsi="Ubuntu Sans Mono"/>
+              </w:rPr>
+            </w:pPr>
+            <w:r>
+              <w:rPr>
+                <w:rFonts w:eastAsia="Arial" w:cs="Arial" w:ascii="Ubuntu Sans Mono" w:hAnsi="Ubuntu Sans Mono"/>
+                <w:color w:val="374151"/>
+                <w:sz w:val="22"/>
+                <w:szCs w:val="22"/>
+              </w:rPr>
+              <w:t>THIS WAS UPDATED</w:t>
+            </w:r>
+          </w:p>
         </w:tc>
       </w:tr>
       <w:tr>
@@ -2909,39 +2437,27 @@
               <w:t>The agent strips non-string content blocks (Claude tool_use blocks) before re-submitting history. Works correctly but should be stress-tested across 10+ turn conversations to ensure no message format errors.</w:t>
             </w:r>
           </w:p>
+          <w:p>
+            <w:pPr>
+              <w:pStyle w:val="normal1"/>
+              <w:spacing w:lineRule="auto" w:line="240" w:before="60" w:after="0"/>
+              <w:rPr>
+                <w:rFonts w:ascii="Ubuntu Sans Mono" w:hAnsi="Ubuntu Sans Mono"/>
+              </w:rPr>
+            </w:pPr>
+            <w:r>
+              <w:rPr>
+                <w:rFonts w:eastAsia="Arial" w:cs="Arial" w:ascii="Ubuntu Sans Mono" w:hAnsi="Ubuntu Sans Mono"/>
+                <w:color w:val="374151"/>
+                <w:sz w:val="22"/>
+                <w:szCs w:val="22"/>
+              </w:rPr>
+              <w:t>THIS WAS UPDATED</w:t>
+            </w:r>
+          </w:p>
         </w:tc>
       </w:tr>
     </w:tbl>
-    <w:p>
-      <w:pPr>
-        <w:pStyle w:val="normal1"/>
-        <w:spacing w:lineRule="auto" w:line="240" w:before="300" w:after="0"/>
-        <w:rPr>
-          <w:rFonts w:ascii="Ubuntu Sans Mono" w:hAnsi="Ubuntu Sans Mono"/>
-        </w:rPr>
-      </w:pPr>
-      <w:r>
-        <w:rPr>
-          <w:rFonts w:ascii="Ubuntu Sans Mono" w:hAnsi="Ubuntu Sans Mono"/>
-        </w:rPr>
-      </w:r>
-    </w:p>
-    <w:p>
-      <w:pPr>
-        <w:pStyle w:val="normal1"/>
-        <w:rPr>
-          <w:rFonts w:ascii="Ubuntu Sans Mono" w:hAnsi="Ubuntu Sans Mono"/>
-        </w:rPr>
-      </w:pPr>
-      <w:r>
-        <w:rPr>
-          <w:rFonts w:ascii="Ubuntu Sans Mono" w:hAnsi="Ubuntu Sans Mono"/>
-        </w:rPr>
-      </w:r>
-      <w:r>
-        <w:br w:type="page"/>
-      </w:r>
-    </w:p>
     <w:tbl>
       <w:tblPr>
         <w:tblStyle w:val="Table8"/>
@@ -2978,6 +2494,9 @@
               </w:rPr>
             </w:pPr>
             <w:r>
+              <w:br w:type="page"/>
+            </w:r>
+            <w:r>
               <w:rPr>
                 <w:rFonts w:eastAsia="Arial" w:cs="Arial" w:ascii="Ubuntu Sans Mono" w:hAnsi="Ubuntu Sans Mono"/>
                 <w:b/>
@@ -2986,36 +2505,23 @@
                 <w:sz w:val="34"/>
                 <w:szCs w:val="34"/>
               </w:rPr>
-              <w:t>Next Steps — Before Capstone Submission</w:t>
+              <w:t xml:space="preserve">Next Steps — Before Capstone Submission - </w:t>
+            </w:r>
+            <w:r>
+              <w:rPr>
+                <w:rFonts w:eastAsia="Arial" w:cs="Arial" w:ascii="Ubuntu Sans Mono" w:hAnsi="Ubuntu Sans Mono"/>
+                <w:b/>
+                <w:bCs/>
+                <w:color w:val="FFFFFF"/>
+                <w:sz w:val="34"/>
+                <w:szCs w:val="34"/>
+              </w:rPr>
+              <w:t>OK</w:t>
             </w:r>
           </w:p>
         </w:tc>
       </w:tr>
     </w:tbl>
-    <w:p>
-      <w:pPr>
-        <w:pStyle w:val="normal1"/>
-        <w:spacing w:lineRule="auto" w:line="240" w:before="200" w:after="0"/>
-        <w:rPr>
-          <w:rFonts w:ascii="Ubuntu Sans Mono" w:hAnsi="Ubuntu Sans Mono" w:eastAsia="Arial" w:cs="Arial"/>
-          <w:b/>
-          <w:bCs/>
-          <w:color w:val="2563EB"/>
-          <w:sz w:val="26"/>
-          <w:szCs w:val="26"/>
-        </w:rPr>
-      </w:pPr>
-      <w:r>
-        <w:rPr>
-          <w:rFonts w:eastAsia="Arial" w:cs="Arial" w:ascii="Ubuntu Sans Mono" w:hAnsi="Ubuntu Sans Mono"/>
-          <w:b/>
-          <w:bCs/>
-          <w:color w:val="2563EB"/>
-          <w:sz w:val="26"/>
-          <w:szCs w:val="26"/>
-        </w:rPr>
-      </w:r>
-    </w:p>
     <w:tbl>
       <w:tblPr>
         <w:tblStyle w:val="Table9"/>
@@ -3079,216 +2585,6 @@
               <w:bottom w:val="single" w:sz="4" w:space="0" w:color="E5E7EB"/>
               <w:end w:val="single" w:sz="4" w:space="0" w:color="E5E7EB"/>
             </w:tcBorders>
-            <w:shd w:fill="1E3A5F" w:val="clear"/>
-            <w:tcMar>
-              <w:start w:w="160" w:type="dxa"/>
-              <w:end w:w="160" w:type="dxa"/>
-            </w:tcMar>
-          </w:tcPr>
-          <w:p>
-            <w:pPr>
-              <w:pStyle w:val="normal1"/>
-              <w:rPr>
-                <w:rFonts w:ascii="Ubuntu Sans Mono" w:hAnsi="Ubuntu Sans Mono"/>
-              </w:rPr>
-            </w:pPr>
-            <w:r>
-              <w:rPr>
-                <w:rFonts w:eastAsia="Arial" w:cs="Arial" w:ascii="Ubuntu Sans Mono" w:hAnsi="Ubuntu Sans Mono"/>
-                <w:b/>
-                <w:bCs/>
-                <w:color w:val="FFFFFF"/>
-                <w:sz w:val="22"/>
-                <w:szCs w:val="22"/>
-              </w:rPr>
-              <w:t>Task</w:t>
-            </w:r>
-          </w:p>
-        </w:tc>
-        <w:tc>
-          <w:tcPr>
-            <w:tcW w:w="1760" w:type="dxa"/>
-            <w:tcBorders>
-              <w:top w:val="single" w:sz="4" w:space="0" w:color="E5E7EB"/>
-              <w:start w:val="single" w:sz="4" w:space="0" w:color="E5E7EB"/>
-              <w:bottom w:val="single" w:sz="4" w:space="0" w:color="E5E7EB"/>
-              <w:end w:val="single" w:sz="4" w:space="0" w:color="E5E7EB"/>
-            </w:tcBorders>
-            <w:shd w:fill="1E3A5F" w:val="clear"/>
-            <w:tcMar>
-              <w:start w:w="120" w:type="dxa"/>
-              <w:end w:w="120" w:type="dxa"/>
-            </w:tcMar>
-          </w:tcPr>
-          <w:p>
-            <w:pPr>
-              <w:pStyle w:val="normal1"/>
-              <w:jc w:val="center"/>
-              <w:rPr>
-                <w:rFonts w:ascii="Ubuntu Sans Mono" w:hAnsi="Ubuntu Sans Mono"/>
-              </w:rPr>
-            </w:pPr>
-            <w:r>
-              <w:rPr>
-                <w:rFonts w:eastAsia="Arial" w:cs="Arial" w:ascii="Ubuntu Sans Mono" w:hAnsi="Ubuntu Sans Mono"/>
-                <w:b/>
-                <w:bCs/>
-                <w:color w:val="FFFFFF"/>
-                <w:sz w:val="22"/>
-                <w:szCs w:val="22"/>
-              </w:rPr>
-              <w:t>Status</w:t>
-            </w:r>
-          </w:p>
-        </w:tc>
-      </w:tr>
-      <w:tr>
-        <w:trPr/>
-        <w:tc>
-          <w:tcPr>
-            <w:tcW w:w="640" w:type="dxa"/>
-            <w:tcBorders>
-              <w:top w:val="single" w:sz="4" w:space="0" w:color="E5E7EB"/>
-              <w:start w:val="single" w:sz="4" w:space="0" w:color="E5E7EB"/>
-              <w:bottom w:val="single" w:sz="4" w:space="0" w:color="E5E7EB"/>
-              <w:end w:val="single" w:sz="4" w:space="0" w:color="E5E7EB"/>
-            </w:tcBorders>
-            <w:shd w:fill="FFFFFF" w:val="clear"/>
-          </w:tcPr>
-          <w:p>
-            <w:pPr>
-              <w:pStyle w:val="normal1"/>
-              <w:jc w:val="center"/>
-              <w:rPr>
-                <w:rFonts w:ascii="Ubuntu Sans Mono" w:hAnsi="Ubuntu Sans Mono"/>
-              </w:rPr>
-            </w:pPr>
-            <w:r>
-              <w:rPr>
-                <w:rFonts w:eastAsia="Arial" w:cs="Arial" w:ascii="Ubuntu Sans Mono" w:hAnsi="Ubuntu Sans Mono"/>
-                <w:b/>
-                <w:bCs/>
-                <w:color w:val="15803D"/>
-                <w:sz w:val="22"/>
-                <w:szCs w:val="22"/>
-              </w:rPr>
-              <w:t>1</w:t>
-            </w:r>
-          </w:p>
-        </w:tc>
-        <w:tc>
-          <w:tcPr>
-            <w:tcW w:w="6960" w:type="dxa"/>
-            <w:tcBorders>
-              <w:top w:val="single" w:sz="4" w:space="0" w:color="E5E7EB"/>
-              <w:start w:val="single" w:sz="4" w:space="0" w:color="E5E7EB"/>
-              <w:bottom w:val="single" w:sz="4" w:space="0" w:color="E5E7EB"/>
-              <w:end w:val="single" w:sz="4" w:space="0" w:color="E5E7EB"/>
-            </w:tcBorders>
-            <w:shd w:fill="F9FAFB" w:val="clear"/>
-            <w:tcMar>
-              <w:start w:w="160" w:type="dxa"/>
-              <w:end w:w="160" w:type="dxa"/>
-            </w:tcMar>
-          </w:tcPr>
-          <w:p>
-            <w:pPr>
-              <w:pStyle w:val="normal1"/>
-              <w:rPr>
-                <w:rFonts w:ascii="Ubuntu Sans Mono" w:hAnsi="Ubuntu Sans Mono"/>
-              </w:rPr>
-            </w:pPr>
-            <w:r>
-              <w:rPr>
-                <w:rFonts w:eastAsia="Arial" w:cs="Arial" w:ascii="Ubuntu Sans Mono" w:hAnsi="Ubuntu Sans Mono"/>
-                <w:color w:val="374151"/>
-                <w:sz w:val="22"/>
-                <w:szCs w:val="22"/>
-              </w:rPr>
-              <w:t>Set up folder Performance-Intelligence-Agent with all project files</w:t>
-            </w:r>
-          </w:p>
-        </w:tc>
-        <w:tc>
-          <w:tcPr>
-            <w:tcW w:w="1760" w:type="dxa"/>
-            <w:tcBorders>
-              <w:top w:val="single" w:sz="4" w:space="0" w:color="E5E7EB"/>
-              <w:start w:val="single" w:sz="4" w:space="0" w:color="E5E7EB"/>
-              <w:bottom w:val="single" w:sz="4" w:space="0" w:color="E5E7EB"/>
-              <w:end w:val="single" w:sz="4" w:space="0" w:color="E5E7EB"/>
-            </w:tcBorders>
-            <w:shd w:fill="DC2626" w:val="clear"/>
-            <w:tcMar>
-              <w:start w:w="120" w:type="dxa"/>
-              <w:end w:w="120" w:type="dxa"/>
-            </w:tcMar>
-          </w:tcPr>
-          <w:p>
-            <w:pPr>
-              <w:pStyle w:val="normal1"/>
-              <w:jc w:val="center"/>
-              <w:rPr>
-                <w:rFonts w:ascii="Ubuntu Sans Mono" w:hAnsi="Ubuntu Sans Mono"/>
-              </w:rPr>
-            </w:pPr>
-            <w:r>
-              <w:rPr>
-                <w:rFonts w:eastAsia="Arial" w:cs="Arial" w:ascii="Ubuntu Sans Mono" w:hAnsi="Ubuntu Sans Mono"/>
-                <w:b/>
-                <w:bCs/>
-                <w:color w:val="FFFFFF"/>
-                <w:sz w:val="19"/>
-                <w:szCs w:val="19"/>
-              </w:rPr>
-              <w:t>Do now</w:t>
-            </w:r>
-          </w:p>
-        </w:tc>
-      </w:tr>
-      <w:tr>
-        <w:trPr/>
-        <w:tc>
-          <w:tcPr>
-            <w:tcW w:w="640" w:type="dxa"/>
-            <w:tcBorders>
-              <w:top w:val="single" w:sz="4" w:space="0" w:color="E5E7EB"/>
-              <w:start w:val="single" w:sz="4" w:space="0" w:color="E5E7EB"/>
-              <w:bottom w:val="single" w:sz="4" w:space="0" w:color="E5E7EB"/>
-              <w:end w:val="single" w:sz="4" w:space="0" w:color="E5E7EB"/>
-            </w:tcBorders>
-            <w:shd w:fill="D1FAE5" w:val="clear"/>
-          </w:tcPr>
-          <w:p>
-            <w:pPr>
-              <w:pStyle w:val="normal1"/>
-              <w:jc w:val="center"/>
-              <w:rPr>
-                <w:rFonts w:ascii="Ubuntu Sans Mono" w:hAnsi="Ubuntu Sans Mono"/>
-              </w:rPr>
-            </w:pPr>
-            <w:r>
-              <w:rPr>
-                <w:rFonts w:eastAsia="Arial" w:cs="Arial" w:ascii="Ubuntu Sans Mono" w:hAnsi="Ubuntu Sans Mono"/>
-                <w:b/>
-                <w:bCs/>
-                <w:color w:val="15803D"/>
-                <w:sz w:val="22"/>
-                <w:szCs w:val="22"/>
-              </w:rPr>
-              <w:t>2</w:t>
-            </w:r>
-          </w:p>
-        </w:tc>
-        <w:tc>
-          <w:tcPr>
-            <w:tcW w:w="6960" w:type="dxa"/>
-            <w:tcBorders>
-              <w:top w:val="single" w:sz="4" w:space="0" w:color="E5E7EB"/>
-              <w:start w:val="single" w:sz="4" w:space="0" w:color="E5E7EB"/>
-              <w:bottom w:val="single" w:sz="4" w:space="0" w:color="E5E7EB"/>
-              <w:end w:val="single" w:sz="4" w:space="0" w:color="E5E7EB"/>
-            </w:tcBorders>
             <w:shd w:fill="FFFFFF" w:val="clear"/>
             <w:tcMar>
               <w:start w:w="160" w:type="dxa"/>
@@ -3305,11 +2601,13 @@
             <w:r>
               <w:rPr>
                 <w:rFonts w:eastAsia="Arial" w:cs="Arial" w:ascii="Ubuntu Sans Mono" w:hAnsi="Ubuntu Sans Mono"/>
-                <w:color w:val="374151"/>
-                <w:sz w:val="22"/>
-                <w:szCs w:val="22"/>
-              </w:rPr>
-              <w:t>Push to GitHub repository (see GitHub guide section)</w:t>
+                <w:b/>
+                <w:bCs/>
+                <w:color w:val="FFFFFF"/>
+                <w:sz w:val="22"/>
+                <w:szCs w:val="22"/>
+              </w:rPr>
+              <w:t>Task</w:t>
             </w:r>
           </w:p>
         </w:tc>
@@ -3322,7 +2620,7 @@
               <w:bottom w:val="single" w:sz="4" w:space="0" w:color="E5E7EB"/>
               <w:end w:val="single" w:sz="4" w:space="0" w:color="E5E7EB"/>
             </w:tcBorders>
-            <w:shd w:fill="DC2626" w:val="clear"/>
+            <w:shd w:fill="FFFFFF" w:val="clear"/>
             <w:tcMar>
               <w:start w:w="120" w:type="dxa"/>
               <w:end w:w="120" w:type="dxa"/>
@@ -3333,19 +2631,19 @@
               <w:pStyle w:val="normal1"/>
               <w:jc w:val="center"/>
               <w:rPr>
-                <w:rFonts w:ascii="Ubuntu Sans Mono" w:hAnsi="Ubuntu Sans Mono"/>
-              </w:rPr>
-            </w:pPr>
-            <w:r>
-              <w:rPr>
-                <w:rFonts w:eastAsia="Arial" w:cs="Arial" w:ascii="Ubuntu Sans Mono" w:hAnsi="Ubuntu Sans Mono"/>
-                <w:b/>
-                <w:bCs/>
-                <w:color w:val="FFFFFF"/>
-                <w:sz w:val="19"/>
-                <w:szCs w:val="19"/>
-              </w:rPr>
-              <w:t>Do now</w:t>
+                <w:color w:val="168253"/>
+              </w:rPr>
+            </w:pPr>
+            <w:r>
+              <w:rPr>
+                <w:rFonts w:eastAsia="Arial" w:cs="Arial" w:ascii="Ubuntu Sans Mono" w:hAnsi="Ubuntu Sans Mono"/>
+                <w:b/>
+                <w:bCs/>
+                <w:color w:val="168253"/>
+                <w:sz w:val="22"/>
+                <w:szCs w:val="22"/>
+              </w:rPr>
+              <w:t>Status</w:t>
             </w:r>
           </w:p>
         </w:tc>
@@ -3380,111 +2678,7 @@
                 <w:sz w:val="22"/>
                 <w:szCs w:val="22"/>
               </w:rPr>
-              <w:t>3</w:t>
-            </w:r>
-          </w:p>
-        </w:tc>
-        <w:tc>
-          <w:tcPr>
-            <w:tcW w:w="6960" w:type="dxa"/>
-            <w:tcBorders>
-              <w:top w:val="single" w:sz="4" w:space="0" w:color="E5E7EB"/>
-              <w:start w:val="single" w:sz="4" w:space="0" w:color="E5E7EB"/>
-              <w:bottom w:val="single" w:sz="4" w:space="0" w:color="E5E7EB"/>
-              <w:end w:val="single" w:sz="4" w:space="0" w:color="E5E7EB"/>
-            </w:tcBorders>
-            <w:shd w:fill="F9FAFB" w:val="clear"/>
-            <w:tcMar>
-              <w:start w:w="160" w:type="dxa"/>
-              <w:end w:w="160" w:type="dxa"/>
-            </w:tcMar>
-          </w:tcPr>
-          <w:p>
-            <w:pPr>
-              <w:pStyle w:val="normal1"/>
-              <w:rPr>
-                <w:rFonts w:ascii="Ubuntu Sans Mono" w:hAnsi="Ubuntu Sans Mono"/>
-              </w:rPr>
-            </w:pPr>
-            <w:r>
-              <w:rPr>
-                <w:rFonts w:eastAsia="Arial" w:cs="Arial" w:ascii="Ubuntu Sans Mono" w:hAnsi="Ubuntu Sans Mono"/>
-                <w:color w:val="374151"/>
-                <w:sz w:val="22"/>
-                <w:szCs w:val="22"/>
-              </w:rPr>
-              <w:t>Create .env file with ANTHROPIC_API_KEY=sk-... (never commit this)</w:t>
-            </w:r>
-          </w:p>
-        </w:tc>
-        <w:tc>
-          <w:tcPr>
-            <w:tcW w:w="1760" w:type="dxa"/>
-            <w:tcBorders>
-              <w:top w:val="single" w:sz="4" w:space="0" w:color="E5E7EB"/>
-              <w:start w:val="single" w:sz="4" w:space="0" w:color="E5E7EB"/>
-              <w:bottom w:val="single" w:sz="4" w:space="0" w:color="E5E7EB"/>
-              <w:end w:val="single" w:sz="4" w:space="0" w:color="E5E7EB"/>
-            </w:tcBorders>
-            <w:shd w:fill="DC2626" w:val="clear"/>
-            <w:tcMar>
-              <w:start w:w="120" w:type="dxa"/>
-              <w:end w:w="120" w:type="dxa"/>
-            </w:tcMar>
-          </w:tcPr>
-          <w:p>
-            <w:pPr>
-              <w:pStyle w:val="normal1"/>
-              <w:jc w:val="center"/>
-              <w:rPr>
-                <w:rFonts w:ascii="Ubuntu Sans Mono" w:hAnsi="Ubuntu Sans Mono"/>
-              </w:rPr>
-            </w:pPr>
-            <w:r>
-              <w:rPr>
-                <w:rFonts w:eastAsia="Arial" w:cs="Arial" w:ascii="Ubuntu Sans Mono" w:hAnsi="Ubuntu Sans Mono"/>
-                <w:b/>
-                <w:bCs/>
-                <w:color w:val="FFFFFF"/>
-                <w:sz w:val="19"/>
-                <w:szCs w:val="19"/>
-              </w:rPr>
-              <w:t>Do now</w:t>
-            </w:r>
-          </w:p>
-        </w:tc>
-      </w:tr>
-      <w:tr>
-        <w:trPr/>
-        <w:tc>
-          <w:tcPr>
-            <w:tcW w:w="640" w:type="dxa"/>
-            <w:tcBorders>
-              <w:top w:val="single" w:sz="4" w:space="0" w:color="E5E7EB"/>
-              <w:start w:val="single" w:sz="4" w:space="0" w:color="E5E7EB"/>
-              <w:bottom w:val="single" w:sz="4" w:space="0" w:color="E5E7EB"/>
-              <w:end w:val="single" w:sz="4" w:space="0" w:color="E5E7EB"/>
-            </w:tcBorders>
-            <w:shd w:fill="D1FAE5" w:val="clear"/>
-          </w:tcPr>
-          <w:p>
-            <w:pPr>
-              <w:pStyle w:val="normal1"/>
-              <w:jc w:val="center"/>
-              <w:rPr>
-                <w:rFonts w:ascii="Ubuntu Sans Mono" w:hAnsi="Ubuntu Sans Mono"/>
-              </w:rPr>
-            </w:pPr>
-            <w:r>
-              <w:rPr>
-                <w:rFonts w:eastAsia="Arial" w:cs="Arial" w:ascii="Ubuntu Sans Mono" w:hAnsi="Ubuntu Sans Mono"/>
-                <w:b/>
-                <w:bCs/>
-                <w:color w:val="15803D"/>
-                <w:sz w:val="22"/>
-                <w:szCs w:val="22"/>
-              </w:rPr>
-              <w:t>4</w:t>
+              <w:t>1</w:t>
             </w:r>
           </w:p>
         </w:tc>
@@ -3517,7 +2711,7 @@
                 <w:sz w:val="22"/>
                 <w:szCs w:val="22"/>
               </w:rPr>
-              <w:t>pip install -r requirements.txt and run streamlit run app.py</w:t>
+              <w:t>Set up folder Performance-Intelligence-Agent with all project files</w:t>
             </w:r>
           </w:p>
         </w:tc>
@@ -3530,7 +2724,7 @@
               <w:bottom w:val="single" w:sz="4" w:space="0" w:color="E5E7EB"/>
               <w:end w:val="single" w:sz="4" w:space="0" w:color="E5E7EB"/>
             </w:tcBorders>
-            <w:shd w:fill="D97706" w:val="clear"/>
+            <w:shd w:fill="FFFFFF" w:val="clear"/>
             <w:tcMar>
               <w:start w:w="120" w:type="dxa"/>
               <w:end w:w="120" w:type="dxa"/>
@@ -3541,19 +2735,19 @@
               <w:pStyle w:val="normal1"/>
               <w:jc w:val="center"/>
               <w:rPr>
-                <w:rFonts w:ascii="Ubuntu Sans Mono" w:hAnsi="Ubuntu Sans Mono"/>
-              </w:rPr>
-            </w:pPr>
-            <w:r>
-              <w:rPr>
-                <w:rFonts w:eastAsia="Arial" w:cs="Arial" w:ascii="Ubuntu Sans Mono" w:hAnsi="Ubuntu Sans Mono"/>
-                <w:b/>
-                <w:bCs/>
-                <w:color w:val="FFFFFF"/>
+                <w:color w:val="168253"/>
+              </w:rPr>
+            </w:pPr>
+            <w:r>
+              <w:rPr>
+                <w:rFonts w:eastAsia="Arial" w:cs="Arial" w:ascii="Ubuntu Sans Mono" w:hAnsi="Ubuntu Sans Mono"/>
+                <w:b/>
+                <w:bCs/>
+                <w:color w:val="168253"/>
                 <w:sz w:val="19"/>
                 <w:szCs w:val="19"/>
               </w:rPr>
-              <w:t>Test</w:t>
+              <w:t>DONE</w:t>
             </w:r>
           </w:p>
         </w:tc>
@@ -3569,7 +2763,7 @@
               <w:bottom w:val="single" w:sz="4" w:space="0" w:color="E5E7EB"/>
               <w:end w:val="single" w:sz="4" w:space="0" w:color="E5E7EB"/>
             </w:tcBorders>
-            <w:shd w:fill="FFFFFF" w:val="clear"/>
+            <w:shd w:fill="D1FAE5" w:val="clear"/>
           </w:tcPr>
           <w:p>
             <w:pPr>
@@ -3588,111 +2782,7 @@
                 <w:sz w:val="22"/>
                 <w:szCs w:val="22"/>
               </w:rPr>
-              <w:t>5</w:t>
-            </w:r>
-          </w:p>
-        </w:tc>
-        <w:tc>
-          <w:tcPr>
-            <w:tcW w:w="6960" w:type="dxa"/>
-            <w:tcBorders>
-              <w:top w:val="single" w:sz="4" w:space="0" w:color="E5E7EB"/>
-              <w:start w:val="single" w:sz="4" w:space="0" w:color="E5E7EB"/>
-              <w:bottom w:val="single" w:sz="4" w:space="0" w:color="E5E7EB"/>
-              <w:end w:val="single" w:sz="4" w:space="0" w:color="E5E7EB"/>
-            </w:tcBorders>
-            <w:shd w:fill="F9FAFB" w:val="clear"/>
-            <w:tcMar>
-              <w:start w:w="160" w:type="dxa"/>
-              <w:end w:w="160" w:type="dxa"/>
-            </w:tcMar>
-          </w:tcPr>
-          <w:p>
-            <w:pPr>
-              <w:pStyle w:val="normal1"/>
-              <w:rPr>
-                <w:rFonts w:ascii="Ubuntu Sans Mono" w:hAnsi="Ubuntu Sans Mono"/>
-              </w:rPr>
-            </w:pPr>
-            <w:r>
-              <w:rPr>
-                <w:rFonts w:eastAsia="Arial" w:cs="Arial" w:ascii="Ubuntu Sans Mono" w:hAnsi="Ubuntu Sans Mono"/>
-                <w:color w:val="374151"/>
-                <w:sz w:val="22"/>
-                <w:szCs w:val="22"/>
-              </w:rPr>
-              <w:t>Add @st.cache_data to load_sugarwod() in app.py</w:t>
-            </w:r>
-          </w:p>
-        </w:tc>
-        <w:tc>
-          <w:tcPr>
-            <w:tcW w:w="1760" w:type="dxa"/>
-            <w:tcBorders>
-              <w:top w:val="single" w:sz="4" w:space="0" w:color="E5E7EB"/>
-              <w:start w:val="single" w:sz="4" w:space="0" w:color="E5E7EB"/>
-              <w:bottom w:val="single" w:sz="4" w:space="0" w:color="E5E7EB"/>
-              <w:end w:val="single" w:sz="4" w:space="0" w:color="E5E7EB"/>
-            </w:tcBorders>
-            <w:shd w:fill="2563EB" w:val="clear"/>
-            <w:tcMar>
-              <w:start w:w="120" w:type="dxa"/>
-              <w:end w:w="120" w:type="dxa"/>
-            </w:tcMar>
-          </w:tcPr>
-          <w:p>
-            <w:pPr>
-              <w:pStyle w:val="normal1"/>
-              <w:jc w:val="center"/>
-              <w:rPr>
-                <w:rFonts w:ascii="Ubuntu Sans Mono" w:hAnsi="Ubuntu Sans Mono"/>
-              </w:rPr>
-            </w:pPr>
-            <w:r>
-              <w:rPr>
-                <w:rFonts w:eastAsia="Arial" w:cs="Arial" w:ascii="Ubuntu Sans Mono" w:hAnsi="Ubuntu Sans Mono"/>
-                <w:b/>
-                <w:bCs/>
-                <w:color w:val="FFFFFF"/>
-                <w:sz w:val="19"/>
-                <w:szCs w:val="19"/>
-              </w:rPr>
-              <w:t>Quick fix</w:t>
-            </w:r>
-          </w:p>
-        </w:tc>
-      </w:tr>
-      <w:tr>
-        <w:trPr/>
-        <w:tc>
-          <w:tcPr>
-            <w:tcW w:w="640" w:type="dxa"/>
-            <w:tcBorders>
-              <w:top w:val="single" w:sz="4" w:space="0" w:color="E5E7EB"/>
-              <w:start w:val="single" w:sz="4" w:space="0" w:color="E5E7EB"/>
-              <w:bottom w:val="single" w:sz="4" w:space="0" w:color="E5E7EB"/>
-              <w:end w:val="single" w:sz="4" w:space="0" w:color="E5E7EB"/>
-            </w:tcBorders>
-            <w:shd w:fill="D1FAE5" w:val="clear"/>
-          </w:tcPr>
-          <w:p>
-            <w:pPr>
-              <w:pStyle w:val="normal1"/>
-              <w:jc w:val="center"/>
-              <w:rPr>
-                <w:rFonts w:ascii="Ubuntu Sans Mono" w:hAnsi="Ubuntu Sans Mono"/>
-              </w:rPr>
-            </w:pPr>
-            <w:r>
-              <w:rPr>
-                <w:rFonts w:eastAsia="Arial" w:cs="Arial" w:ascii="Ubuntu Sans Mono" w:hAnsi="Ubuntu Sans Mono"/>
-                <w:b/>
-                <w:bCs/>
-                <w:color w:val="15803D"/>
-                <w:sz w:val="22"/>
-                <w:szCs w:val="22"/>
-              </w:rPr>
-              <w:t>6</w:t>
+              <w:t>2</w:t>
             </w:r>
           </w:p>
         </w:tc>
@@ -3720,19 +2810,12 @@
             </w:pPr>
             <w:r>
               <w:rPr>
-                <w:rFonts w:ascii="Ubuntu Sans Mono" w:hAnsi="Ubuntu Sans Mono"/>
+                <w:rFonts w:eastAsia="Arial" w:cs="Arial" w:ascii="Ubuntu Sans Mono" w:hAnsi="Ubuntu Sans Mono"/>
                 <w:color w:val="374151"/>
-              </w:rPr>
-              <w:t>Double check/review</w:t>
-            </w:r>
-            <w:r>
-              <w:rPr>
-                <w:rFonts w:eastAsia="Arial" w:cs="Arial" w:ascii="Ubuntu Sans Mono" w:hAnsi="Ubuntu Sans Mono"/>
-                <w:color w:val="374151"/>
-                <w:sz w:val="22"/>
-                <w:szCs w:val="22"/>
-              </w:rPr>
-              <w:t xml:space="preserve"> README.md and written responses doc</w:t>
+                <w:sz w:val="22"/>
+                <w:szCs w:val="22"/>
+              </w:rPr>
+              <w:t>Push to GitHub repository (see GitHub guide section)</w:t>
             </w:r>
           </w:p>
         </w:tc>
@@ -3745,7 +2828,7 @@
               <w:bottom w:val="single" w:sz="4" w:space="0" w:color="E5E7EB"/>
               <w:end w:val="single" w:sz="4" w:space="0" w:color="E5E7EB"/>
             </w:tcBorders>
-            <w:shd w:fill="2563EB" w:val="clear"/>
+            <w:shd w:fill="FFFFFF" w:val="clear"/>
             <w:tcMar>
               <w:start w:w="120" w:type="dxa"/>
               <w:end w:w="120" w:type="dxa"/>
@@ -3756,19 +2839,19 @@
               <w:pStyle w:val="normal1"/>
               <w:jc w:val="center"/>
               <w:rPr>
-                <w:rFonts w:ascii="Ubuntu Sans Mono" w:hAnsi="Ubuntu Sans Mono"/>
-              </w:rPr>
-            </w:pPr>
-            <w:r>
-              <w:rPr>
-                <w:rFonts w:eastAsia="Arial" w:cs="Arial" w:ascii="Ubuntu Sans Mono" w:hAnsi="Ubuntu Sans Mono"/>
-                <w:b/>
-                <w:bCs/>
-                <w:color w:val="FFFFFF"/>
+                <w:color w:val="168253"/>
+              </w:rPr>
+            </w:pPr>
+            <w:r>
+              <w:rPr>
+                <w:rFonts w:eastAsia="Arial" w:cs="Arial" w:ascii="Ubuntu Sans Mono" w:hAnsi="Ubuntu Sans Mono"/>
+                <w:b/>
+                <w:bCs/>
+                <w:color w:val="168253"/>
                 <w:sz w:val="19"/>
                 <w:szCs w:val="19"/>
               </w:rPr>
-              <w:t>Quick fix</w:t>
+              <w:t>DONE</w:t>
             </w:r>
           </w:p>
         </w:tc>
@@ -3803,7 +2886,7 @@
                 <w:sz w:val="22"/>
                 <w:szCs w:val="22"/>
               </w:rPr>
-              <w:t>7</w:t>
+              <w:t>3</w:t>
             </w:r>
           </w:p>
         </w:tc>
@@ -3816,7 +2899,7 @@
               <w:bottom w:val="single" w:sz="4" w:space="0" w:color="E5E7EB"/>
               <w:end w:val="single" w:sz="4" w:space="0" w:color="E5E7EB"/>
             </w:tcBorders>
-            <w:shd w:fill="F9FAFB" w:val="clear"/>
+            <w:shd w:fill="FFFFFF" w:val="clear"/>
             <w:tcMar>
               <w:start w:w="160" w:type="dxa"/>
               <w:end w:w="160" w:type="dxa"/>
@@ -3836,14 +2919,7 @@
                 <w:sz w:val="22"/>
                 <w:szCs w:val="22"/>
               </w:rPr>
-              <w:t>Record 5–7 min walkthrough video showing all three capstone components (not happy a</w:t>
-            </w:r>
-            <w:r>
-              <w:rPr>
-                <w:rFonts w:ascii="Ubuntu Sans Mono" w:hAnsi="Ubuntu Sans Mono"/>
-                <w:color w:val="374151"/>
-              </w:rPr>
-              <w:t>bout it)</w:t>
+              <w:t>Create .env file with ANTHROPIC_API_KEY=sk-... (never commit this)</w:t>
             </w:r>
           </w:p>
         </w:tc>
@@ -3856,7 +2932,7 @@
               <w:bottom w:val="single" w:sz="4" w:space="0" w:color="E5E7EB"/>
               <w:end w:val="single" w:sz="4" w:space="0" w:color="E5E7EB"/>
             </w:tcBorders>
-            <w:shd w:fill="2563EB" w:val="clear"/>
+            <w:shd w:fill="FFFFFF" w:val="clear"/>
             <w:tcMar>
               <w:start w:w="120" w:type="dxa"/>
               <w:end w:w="120" w:type="dxa"/>
@@ -3867,54 +2943,454 @@
               <w:pStyle w:val="normal1"/>
               <w:jc w:val="center"/>
               <w:rPr>
-                <w:rFonts w:ascii="Ubuntu Sans Mono" w:hAnsi="Ubuntu Sans Mono"/>
-              </w:rPr>
-            </w:pPr>
-            <w:r>
-              <w:rPr>
-                <w:rFonts w:eastAsia="Arial" w:cs="Arial" w:ascii="Ubuntu Sans Mono" w:hAnsi="Ubuntu Sans Mono"/>
-                <w:b/>
-                <w:bCs/>
-                <w:color w:val="FFFFFF"/>
+                <w:color w:val="FF4000"/>
+              </w:rPr>
+            </w:pPr>
+            <w:r>
+              <w:rPr>
+                <w:rFonts w:eastAsia="Arial" w:cs="Arial" w:ascii="Ubuntu Sans Mono" w:hAnsi="Ubuntu Sans Mono"/>
+                <w:b/>
+                <w:bCs/>
+                <w:color w:val="FF4000"/>
                 <w:sz w:val="19"/>
                 <w:szCs w:val="19"/>
               </w:rPr>
+              <w:t>FIX IT</w:t>
+            </w:r>
+          </w:p>
+        </w:tc>
+      </w:tr>
+      <w:tr>
+        <w:trPr/>
+        <w:tc>
+          <w:tcPr>
+            <w:tcW w:w="640" w:type="dxa"/>
+            <w:tcBorders>
+              <w:top w:val="single" w:sz="4" w:space="0" w:color="E5E7EB"/>
+              <w:start w:val="single" w:sz="4" w:space="0" w:color="E5E7EB"/>
+              <w:bottom w:val="single" w:sz="4" w:space="0" w:color="E5E7EB"/>
+              <w:end w:val="single" w:sz="4" w:space="0" w:color="E5E7EB"/>
+            </w:tcBorders>
+            <w:shd w:fill="D1FAE5" w:val="clear"/>
+          </w:tcPr>
+          <w:p>
+            <w:pPr>
+              <w:pStyle w:val="normal1"/>
+              <w:jc w:val="center"/>
+              <w:rPr>
+                <w:rFonts w:ascii="Ubuntu Sans Mono" w:hAnsi="Ubuntu Sans Mono"/>
+              </w:rPr>
+            </w:pPr>
+            <w:r>
+              <w:rPr>
+                <w:rFonts w:eastAsia="Arial" w:cs="Arial" w:ascii="Ubuntu Sans Mono" w:hAnsi="Ubuntu Sans Mono"/>
+                <w:b/>
+                <w:bCs/>
+                <w:color w:val="15803D"/>
+                <w:sz w:val="22"/>
+                <w:szCs w:val="22"/>
+              </w:rPr>
+              <w:t>4</w:t>
+            </w:r>
+          </w:p>
+        </w:tc>
+        <w:tc>
+          <w:tcPr>
+            <w:tcW w:w="6960" w:type="dxa"/>
+            <w:tcBorders>
+              <w:top w:val="single" w:sz="4" w:space="0" w:color="E5E7EB"/>
+              <w:start w:val="single" w:sz="4" w:space="0" w:color="E5E7EB"/>
+              <w:bottom w:val="single" w:sz="4" w:space="0" w:color="E5E7EB"/>
+              <w:end w:val="single" w:sz="4" w:space="0" w:color="E5E7EB"/>
+            </w:tcBorders>
+            <w:shd w:fill="FFFFFF" w:val="clear"/>
+            <w:tcMar>
+              <w:start w:w="160" w:type="dxa"/>
+              <w:end w:w="160" w:type="dxa"/>
+            </w:tcMar>
+          </w:tcPr>
+          <w:p>
+            <w:pPr>
+              <w:pStyle w:val="normal1"/>
+              <w:rPr>
+                <w:rFonts w:ascii="Ubuntu Sans Mono" w:hAnsi="Ubuntu Sans Mono"/>
+              </w:rPr>
+            </w:pPr>
+            <w:r>
+              <w:rPr>
+                <w:rFonts w:eastAsia="Arial" w:cs="Arial" w:ascii="Ubuntu Sans Mono" w:hAnsi="Ubuntu Sans Mono"/>
+                <w:color w:val="374151"/>
+                <w:sz w:val="22"/>
+                <w:szCs w:val="22"/>
+              </w:rPr>
+              <w:t>pip install -r requirements.txt and run streamlit run app.py</w:t>
+            </w:r>
+          </w:p>
+        </w:tc>
+        <w:tc>
+          <w:tcPr>
+            <w:tcW w:w="1760" w:type="dxa"/>
+            <w:tcBorders>
+              <w:top w:val="single" w:sz="4" w:space="0" w:color="E5E7EB"/>
+              <w:start w:val="single" w:sz="4" w:space="0" w:color="E5E7EB"/>
+              <w:bottom w:val="single" w:sz="4" w:space="0" w:color="E5E7EB"/>
+              <w:end w:val="single" w:sz="4" w:space="0" w:color="E5E7EB"/>
+            </w:tcBorders>
+            <w:shd w:fill="FFFFFF" w:val="clear"/>
+            <w:tcMar>
+              <w:start w:w="120" w:type="dxa"/>
+              <w:end w:w="120" w:type="dxa"/>
+            </w:tcMar>
+          </w:tcPr>
+          <w:p>
+            <w:pPr>
+              <w:pStyle w:val="normal1"/>
+              <w:jc w:val="center"/>
+              <w:rPr>
+                <w:color w:val="168253"/>
+              </w:rPr>
+            </w:pPr>
+            <w:r>
+              <w:rPr>
+                <w:rFonts w:eastAsia="Arial" w:cs="Arial" w:ascii="Ubuntu Sans Mono" w:hAnsi="Ubuntu Sans Mono"/>
+                <w:b/>
+                <w:bCs/>
+                <w:color w:val="168253"/>
+                <w:sz w:val="19"/>
+                <w:szCs w:val="19"/>
+              </w:rPr>
+              <w:t>DONE</w:t>
+            </w:r>
+          </w:p>
+        </w:tc>
+      </w:tr>
+      <w:tr>
+        <w:trPr/>
+        <w:tc>
+          <w:tcPr>
+            <w:tcW w:w="640" w:type="dxa"/>
+            <w:tcBorders>
+              <w:top w:val="single" w:sz="4" w:space="0" w:color="E5E7EB"/>
+              <w:start w:val="single" w:sz="4" w:space="0" w:color="E5E7EB"/>
+              <w:bottom w:val="single" w:sz="4" w:space="0" w:color="E5E7EB"/>
+              <w:end w:val="single" w:sz="4" w:space="0" w:color="E5E7EB"/>
+            </w:tcBorders>
+            <w:shd w:fill="FFFFFF" w:val="clear"/>
+          </w:tcPr>
+          <w:p>
+            <w:pPr>
+              <w:pStyle w:val="normal1"/>
+              <w:jc w:val="center"/>
+              <w:rPr>
+                <w:rFonts w:ascii="Ubuntu Sans Mono" w:hAnsi="Ubuntu Sans Mono"/>
+              </w:rPr>
+            </w:pPr>
+            <w:r>
+              <w:rPr>
+                <w:rFonts w:eastAsia="Arial" w:cs="Arial" w:ascii="Ubuntu Sans Mono" w:hAnsi="Ubuntu Sans Mono"/>
+                <w:b/>
+                <w:bCs/>
+                <w:color w:val="15803D"/>
+                <w:sz w:val="22"/>
+                <w:szCs w:val="22"/>
+              </w:rPr>
+              <w:t>5</w:t>
+            </w:r>
+          </w:p>
+        </w:tc>
+        <w:tc>
+          <w:tcPr>
+            <w:tcW w:w="6960" w:type="dxa"/>
+            <w:tcBorders>
+              <w:top w:val="single" w:sz="4" w:space="0" w:color="E5E7EB"/>
+              <w:start w:val="single" w:sz="4" w:space="0" w:color="E5E7EB"/>
+              <w:bottom w:val="single" w:sz="4" w:space="0" w:color="E5E7EB"/>
+              <w:end w:val="single" w:sz="4" w:space="0" w:color="E5E7EB"/>
+            </w:tcBorders>
+            <w:shd w:fill="FFFFFF" w:val="clear"/>
+            <w:tcMar>
+              <w:start w:w="160" w:type="dxa"/>
+              <w:end w:w="160" w:type="dxa"/>
+            </w:tcMar>
+          </w:tcPr>
+          <w:p>
+            <w:pPr>
+              <w:pStyle w:val="normal1"/>
+              <w:rPr>
+                <w:rFonts w:ascii="Ubuntu Sans Mono" w:hAnsi="Ubuntu Sans Mono"/>
+              </w:rPr>
+            </w:pPr>
+            <w:r>
+              <w:rPr>
+                <w:rFonts w:eastAsia="Arial" w:cs="Arial" w:ascii="Ubuntu Sans Mono" w:hAnsi="Ubuntu Sans Mono"/>
+                <w:color w:val="374151"/>
+                <w:sz w:val="22"/>
+                <w:szCs w:val="22"/>
+              </w:rPr>
+              <w:t>Add @st.cache_data to load_sugarwod() in app.py</w:t>
+            </w:r>
+          </w:p>
+        </w:tc>
+        <w:tc>
+          <w:tcPr>
+            <w:tcW w:w="1760" w:type="dxa"/>
+            <w:tcBorders>
+              <w:top w:val="single" w:sz="4" w:space="0" w:color="E5E7EB"/>
+              <w:start w:val="single" w:sz="4" w:space="0" w:color="E5E7EB"/>
+              <w:bottom w:val="single" w:sz="4" w:space="0" w:color="E5E7EB"/>
+              <w:end w:val="single" w:sz="4" w:space="0" w:color="E5E7EB"/>
+            </w:tcBorders>
+            <w:shd w:fill="FFFFFF" w:val="clear"/>
+            <w:tcMar>
+              <w:start w:w="120" w:type="dxa"/>
+              <w:end w:w="120" w:type="dxa"/>
+            </w:tcMar>
+          </w:tcPr>
+          <w:p>
+            <w:pPr>
+              <w:pStyle w:val="normal1"/>
+              <w:jc w:val="center"/>
+              <w:rPr>
+                <w:color w:val="168253"/>
+              </w:rPr>
+            </w:pPr>
+            <w:r>
+              <w:rPr>
+                <w:rFonts w:eastAsia="Arial" w:cs="Arial" w:ascii="Ubuntu Sans Mono" w:hAnsi="Ubuntu Sans Mono"/>
+                <w:b/>
+                <w:bCs/>
+                <w:color w:val="168253"/>
+                <w:sz w:val="19"/>
+                <w:szCs w:val="19"/>
+              </w:rPr>
+              <w:t>DONE</w:t>
+            </w:r>
+          </w:p>
+        </w:tc>
+      </w:tr>
+      <w:tr>
+        <w:trPr/>
+        <w:tc>
+          <w:tcPr>
+            <w:tcW w:w="640" w:type="dxa"/>
+            <w:tcBorders>
+              <w:top w:val="single" w:sz="4" w:space="0" w:color="E5E7EB"/>
+              <w:start w:val="single" w:sz="4" w:space="0" w:color="E5E7EB"/>
+              <w:bottom w:val="single" w:sz="4" w:space="0" w:color="E5E7EB"/>
+              <w:end w:val="single" w:sz="4" w:space="0" w:color="E5E7EB"/>
+            </w:tcBorders>
+            <w:shd w:fill="D1FAE5" w:val="clear"/>
+          </w:tcPr>
+          <w:p>
+            <w:pPr>
+              <w:pStyle w:val="normal1"/>
+              <w:jc w:val="center"/>
+              <w:rPr>
+                <w:rFonts w:ascii="Ubuntu Sans Mono" w:hAnsi="Ubuntu Sans Mono"/>
+              </w:rPr>
+            </w:pPr>
+            <w:r>
+              <w:rPr>
+                <w:rFonts w:eastAsia="Arial" w:cs="Arial" w:ascii="Ubuntu Sans Mono" w:hAnsi="Ubuntu Sans Mono"/>
+                <w:b/>
+                <w:bCs/>
+                <w:color w:val="15803D"/>
+                <w:sz w:val="22"/>
+                <w:szCs w:val="22"/>
+              </w:rPr>
+              <w:t>6</w:t>
+            </w:r>
+          </w:p>
+        </w:tc>
+        <w:tc>
+          <w:tcPr>
+            <w:tcW w:w="6960" w:type="dxa"/>
+            <w:tcBorders>
+              <w:top w:val="single" w:sz="4" w:space="0" w:color="E5E7EB"/>
+              <w:start w:val="single" w:sz="4" w:space="0" w:color="E5E7EB"/>
+              <w:bottom w:val="single" w:sz="4" w:space="0" w:color="E5E7EB"/>
+              <w:end w:val="single" w:sz="4" w:space="0" w:color="E5E7EB"/>
+            </w:tcBorders>
+            <w:shd w:fill="FFFFFF" w:val="clear"/>
+            <w:tcMar>
+              <w:start w:w="160" w:type="dxa"/>
+              <w:end w:w="160" w:type="dxa"/>
+            </w:tcMar>
+          </w:tcPr>
+          <w:p>
+            <w:pPr>
+              <w:pStyle w:val="normal1"/>
+              <w:rPr>
+                <w:rFonts w:ascii="Ubuntu Sans Mono" w:hAnsi="Ubuntu Sans Mono"/>
+              </w:rPr>
+            </w:pPr>
+            <w:r>
+              <w:rPr>
+                <w:rFonts w:ascii="Ubuntu Sans Mono" w:hAnsi="Ubuntu Sans Mono"/>
+                <w:color w:val="374151"/>
+              </w:rPr>
+              <w:t>Double check/review</w:t>
+            </w:r>
+            <w:r>
+              <w:rPr>
+                <w:rFonts w:eastAsia="Arial" w:cs="Arial" w:ascii="Ubuntu Sans Mono" w:hAnsi="Ubuntu Sans Mono"/>
+                <w:color w:val="374151"/>
+                <w:sz w:val="22"/>
+                <w:szCs w:val="22"/>
+              </w:rPr>
+              <w:t xml:space="preserve"> README.md and written responses doc</w:t>
+            </w:r>
+          </w:p>
+        </w:tc>
+        <w:tc>
+          <w:tcPr>
+            <w:tcW w:w="1760" w:type="dxa"/>
+            <w:tcBorders>
+              <w:top w:val="single" w:sz="4" w:space="0" w:color="E5E7EB"/>
+              <w:start w:val="single" w:sz="4" w:space="0" w:color="E5E7EB"/>
+              <w:bottom w:val="single" w:sz="4" w:space="0" w:color="E5E7EB"/>
+              <w:end w:val="single" w:sz="4" w:space="0" w:color="E5E7EB"/>
+            </w:tcBorders>
+            <w:shd w:fill="FFFFFF" w:val="clear"/>
+            <w:tcMar>
+              <w:start w:w="120" w:type="dxa"/>
+              <w:end w:w="120" w:type="dxa"/>
+            </w:tcMar>
+          </w:tcPr>
+          <w:p>
+            <w:pPr>
+              <w:pStyle w:val="normal1"/>
+              <w:jc w:val="center"/>
+              <w:rPr>
+                <w:color w:val="168253"/>
+              </w:rPr>
+            </w:pPr>
+            <w:r>
+              <w:rPr>
+                <w:rFonts w:eastAsia="Arial" w:cs="Arial" w:ascii="Ubuntu Sans Mono" w:hAnsi="Ubuntu Sans Mono"/>
+                <w:b/>
+                <w:bCs/>
+                <w:color w:val="168253"/>
+                <w:sz w:val="19"/>
+                <w:szCs w:val="19"/>
+              </w:rPr>
+              <w:t>DONE</w:t>
+            </w:r>
+          </w:p>
+        </w:tc>
+      </w:tr>
+      <w:tr>
+        <w:trPr/>
+        <w:tc>
+          <w:tcPr>
+            <w:tcW w:w="640" w:type="dxa"/>
+            <w:tcBorders>
+              <w:top w:val="single" w:sz="4" w:space="0" w:color="E5E7EB"/>
+              <w:start w:val="single" w:sz="4" w:space="0" w:color="E5E7EB"/>
+              <w:bottom w:val="single" w:sz="4" w:space="0" w:color="E5E7EB"/>
+              <w:end w:val="single" w:sz="4" w:space="0" w:color="E5E7EB"/>
+            </w:tcBorders>
+            <w:shd w:fill="FFFFFF" w:val="clear"/>
+          </w:tcPr>
+          <w:p>
+            <w:pPr>
+              <w:pStyle w:val="normal1"/>
+              <w:jc w:val="center"/>
+              <w:rPr>
+                <w:rFonts w:ascii="Ubuntu Sans Mono" w:hAnsi="Ubuntu Sans Mono"/>
+              </w:rPr>
+            </w:pPr>
+            <w:r>
+              <w:rPr>
+                <w:rFonts w:eastAsia="Arial" w:cs="Arial" w:ascii="Ubuntu Sans Mono" w:hAnsi="Ubuntu Sans Mono"/>
+                <w:b/>
+                <w:bCs/>
+                <w:color w:val="15803D"/>
+                <w:sz w:val="22"/>
+                <w:szCs w:val="22"/>
+              </w:rPr>
+              <w:t>7</w:t>
+            </w:r>
+          </w:p>
+        </w:tc>
+        <w:tc>
+          <w:tcPr>
+            <w:tcW w:w="6960" w:type="dxa"/>
+            <w:tcBorders>
+              <w:top w:val="single" w:sz="4" w:space="0" w:color="E5E7EB"/>
+              <w:start w:val="single" w:sz="4" w:space="0" w:color="E5E7EB"/>
+              <w:bottom w:val="single" w:sz="4" w:space="0" w:color="E5E7EB"/>
+              <w:end w:val="single" w:sz="4" w:space="0" w:color="E5E7EB"/>
+            </w:tcBorders>
+            <w:shd w:fill="FFFFFF" w:val="clear"/>
+            <w:tcMar>
+              <w:start w:w="160" w:type="dxa"/>
+              <w:end w:w="160" w:type="dxa"/>
+            </w:tcMar>
+          </w:tcPr>
+          <w:p>
+            <w:pPr>
+              <w:pStyle w:val="normal1"/>
+              <w:rPr>
+                <w:rFonts w:ascii="Ubuntu Sans Mono" w:hAnsi="Ubuntu Sans Mono"/>
+              </w:rPr>
+            </w:pPr>
+            <w:r>
+              <w:rPr>
+                <w:rFonts w:eastAsia="Arial" w:cs="Arial" w:ascii="Ubuntu Sans Mono" w:hAnsi="Ubuntu Sans Mono"/>
+                <w:color w:val="374151"/>
+                <w:sz w:val="22"/>
+                <w:szCs w:val="22"/>
+              </w:rPr>
+              <w:t>Record 5–7 min walkthrough video showing all three capstone components (not happy a</w:t>
+            </w:r>
+            <w:r>
+              <w:rPr>
+                <w:rFonts w:ascii="Ubuntu Sans Mono" w:hAnsi="Ubuntu Sans Mono"/>
+                <w:color w:val="374151"/>
+              </w:rPr>
+              <w:t>bout it)</w:t>
+            </w:r>
+          </w:p>
+        </w:tc>
+        <w:tc>
+          <w:tcPr>
+            <w:tcW w:w="1760" w:type="dxa"/>
+            <w:tcBorders>
+              <w:top w:val="single" w:sz="4" w:space="0" w:color="E5E7EB"/>
+              <w:start w:val="single" w:sz="4" w:space="0" w:color="E5E7EB"/>
+              <w:bottom w:val="single" w:sz="4" w:space="0" w:color="E5E7EB"/>
+              <w:end w:val="single" w:sz="4" w:space="0" w:color="E5E7EB"/>
+            </w:tcBorders>
+            <w:shd w:fill="FFFFFF" w:val="clear"/>
+            <w:tcMar>
+              <w:start w:w="120" w:type="dxa"/>
+              <w:end w:w="120" w:type="dxa"/>
+            </w:tcMar>
+          </w:tcPr>
+          <w:p>
+            <w:pPr>
+              <w:pStyle w:val="normal1"/>
+              <w:jc w:val="center"/>
+              <w:rPr>
+                <w:color w:val="FF4000"/>
+              </w:rPr>
+            </w:pPr>
+            <w:r>
+              <w:rPr>
+                <w:rFonts w:eastAsia="Arial" w:cs="Arial" w:ascii="Ubuntu Sans Mono" w:hAnsi="Ubuntu Sans Mono"/>
+                <w:b/>
+                <w:bCs/>
+                <w:color w:val="FF4000"/>
+                <w:sz w:val="19"/>
+                <w:szCs w:val="19"/>
+              </w:rPr>
               <w:t>Submit</w:t>
             </w:r>
           </w:p>
         </w:tc>
       </w:tr>
     </w:tbl>
-    <w:p>
-      <w:pPr>
-        <w:pStyle w:val="normal1"/>
-        <w:spacing w:lineRule="auto" w:line="240" w:before="240" w:after="0"/>
-        <w:rPr>
-          <w:rFonts w:ascii="Ubuntu Sans Mono" w:hAnsi="Ubuntu Sans Mono"/>
-        </w:rPr>
-      </w:pPr>
-      <w:r>
-        <w:rPr>
-          <w:rFonts w:ascii="Ubuntu Sans Mono" w:hAnsi="Ubuntu Sans Mono"/>
-        </w:rPr>
-      </w:r>
-    </w:p>
-    <w:p>
-      <w:pPr>
-        <w:pStyle w:val="normal1"/>
-        <w:rPr>
-          <w:rFonts w:ascii="Ubuntu Sans Mono" w:hAnsi="Ubuntu Sans Mono"/>
-        </w:rPr>
-      </w:pPr>
-      <w:r>
-        <w:rPr>
-          <w:rFonts w:ascii="Ubuntu Sans Mono" w:hAnsi="Ubuntu Sans Mono"/>
-        </w:rPr>
-      </w:r>
-      <w:r>
-        <w:br w:type="page"/>
-      </w:r>
-    </w:p>
     <w:tbl>
       <w:tblPr>
         <w:tblStyle w:val="Table10"/>
@@ -3951,6 +3427,9 @@
               </w:rPr>
             </w:pPr>
             <w:r>
+              <w:br w:type="page"/>
+            </w:r>
+            <w:r>
               <w:rPr>
                 <w:rFonts w:eastAsia="Arial" w:cs="Arial" w:ascii="Ubuntu Sans Mono" w:hAnsi="Ubuntu Sans Mono"/>
                 <w:b/>
@@ -3959,325 +3438,23 @@
                 <w:sz w:val="34"/>
                 <w:szCs w:val="34"/>
               </w:rPr>
-              <w:t>GitHub Reminders</w:t>
+              <w:t xml:space="preserve">GitHub Reminders – </w:t>
+            </w:r>
+            <w:r>
+              <w:rPr>
+                <w:rFonts w:eastAsia="Arial" w:cs="Arial" w:ascii="Ubuntu Sans Mono" w:hAnsi="Ubuntu Sans Mono"/>
+                <w:b/>
+                <w:bCs/>
+                <w:color w:val="FFFFFF"/>
+                <w:sz w:val="34"/>
+                <w:szCs w:val="34"/>
+              </w:rPr>
+              <w:t>DO NOT COMMIT:</w:t>
             </w:r>
           </w:p>
         </w:tc>
       </w:tr>
     </w:tbl>
-    <w:p>
-      <w:pPr>
-        <w:pStyle w:val="Heading2"/>
-        <w:spacing w:lineRule="auto" w:line="240" w:before="240" w:after="120"/>
-        <w:rPr>
-          <w:rFonts w:ascii="Ubuntu Sans Mono" w:hAnsi="Ubuntu Sans Mono"/>
-        </w:rPr>
-      </w:pPr>
-      <w:r>
-        <w:rPr>
-          <w:rFonts w:eastAsia="Arial" w:cs="Arial" w:ascii="Ubuntu Sans Mono" w:hAnsi="Ubuntu Sans Mono"/>
-          <w:b/>
-          <w:bCs/>
-          <w:color w:val="2563EB"/>
-          <w:sz w:val="26"/>
-          <w:szCs w:val="26"/>
-        </w:rPr>
-        <w:t>My everyday Git workflow going forward</w:t>
-      </w:r>
-    </w:p>
-    <w:p>
-      <w:pPr>
-        <w:pStyle w:val="normal1"/>
-        <w:spacing w:lineRule="auto" w:line="240" w:before="60" w:after="120"/>
-        <w:rPr>
-          <w:rFonts w:ascii="Ubuntu Sans Mono" w:hAnsi="Ubuntu Sans Mono"/>
-        </w:rPr>
-      </w:pPr>
-      <w:r>
-        <w:rPr>
-          <w:rFonts w:eastAsia="Arial" w:cs="Arial" w:ascii="Ubuntu Sans Mono" w:hAnsi="Ubuntu Sans Mono"/>
-          <w:color w:val="374151"/>
-          <w:sz w:val="22"/>
-          <w:szCs w:val="22"/>
-        </w:rPr>
-        <w:t>Every time you make changes and want to save them to GitHub:</w:t>
-      </w:r>
-    </w:p>
-    <w:p>
-      <w:pPr>
-        <w:pStyle w:val="normal1"/>
-        <w:spacing w:lineRule="auto" w:line="240" w:before="60" w:after="0"/>
-        <w:rPr>
-          <w:rFonts w:ascii="Ubuntu Sans Mono" w:hAnsi="Ubuntu Sans Mono"/>
-        </w:rPr>
-      </w:pPr>
-      <w:r>
-        <w:rPr>
-          <w:rFonts w:ascii="Ubuntu Sans Mono" w:hAnsi="Ubuntu Sans Mono"/>
-        </w:rPr>
-      </w:r>
-    </w:p>
-    <w:p>
-      <w:pPr>
-        <w:pStyle w:val="normal1"/>
-        <w:keepNext w:val="false"/>
-        <w:keepLines w:val="false"/>
-        <w:pageBreakBefore w:val="false"/>
-        <w:widowControl/>
-        <w:numPr>
-          <w:ilvl w:val="0"/>
-          <w:numId w:val="1"/>
-        </w:numPr>
-        <w:shd w:val="clear" w:fill="auto"/>
-        <w:spacing w:lineRule="auto" w:line="240" w:before="40" w:after="80"/>
-        <w:ind w:hanging="360" w:start="720" w:end="0"/>
-        <w:jc w:val="start"/>
-        <w:rPr>
-          <w:rFonts w:ascii="Ubuntu Sans Mono" w:hAnsi="Ubuntu Sans Mono"/>
-        </w:rPr>
-      </w:pPr>
-      <w:r>
-        <w:rPr>
-          <w:rFonts w:eastAsia="Arial" w:cs="Arial" w:ascii="Ubuntu Sans Mono" w:hAnsi="Ubuntu Sans Mono"/>
-          <w:b w:val="false"/>
-          <w:bCs w:val="false"/>
-          <w:i w:val="false"/>
-          <w:iCs w:val="false"/>
-          <w:caps w:val="false"/>
-          <w:smallCaps w:val="false"/>
-          <w:strike w:val="false"/>
-          <w:dstrike w:val="false"/>
-          <w:color w:val="374151"/>
-          <w:position w:val="0"/>
-          <w:sz w:val="22"/>
-          <w:szCs w:val="22"/>
-          <w:u w:val="none"/>
-          <w:shd w:fill="auto" w:val="clear"/>
-          <w:vertAlign w:val="baseline"/>
-        </w:rPr>
-        <w:t>Make changes to your files</w:t>
-      </w:r>
-    </w:p>
-    <w:p>
-      <w:pPr>
-        <w:pStyle w:val="normal1"/>
-        <w:keepNext w:val="false"/>
-        <w:keepLines w:val="false"/>
-        <w:pageBreakBefore w:val="false"/>
-        <w:widowControl/>
-        <w:numPr>
-          <w:ilvl w:val="0"/>
-          <w:numId w:val="1"/>
-        </w:numPr>
-        <w:shd w:val="clear" w:fill="auto"/>
-        <w:spacing w:lineRule="auto" w:line="240" w:before="40" w:after="80"/>
-        <w:ind w:hanging="360" w:start="720" w:end="0"/>
-        <w:jc w:val="start"/>
-        <w:rPr>
-          <w:rFonts w:ascii="Ubuntu Sans Mono" w:hAnsi="Ubuntu Sans Mono"/>
-        </w:rPr>
-      </w:pPr>
-      <w:r>
-        <w:rPr>
-          <w:rFonts w:eastAsia="Arial" w:cs="Arial" w:ascii="Ubuntu Sans Mono" w:hAnsi="Ubuntu Sans Mono"/>
-          <w:b w:val="false"/>
-          <w:bCs w:val="false"/>
-          <w:i w:val="false"/>
-          <w:iCs w:val="false"/>
-          <w:caps w:val="false"/>
-          <w:smallCaps w:val="false"/>
-          <w:strike w:val="false"/>
-          <w:dstrike w:val="false"/>
-          <w:color w:val="374151"/>
-          <w:position w:val="0"/>
-          <w:sz w:val="22"/>
-          <w:szCs w:val="22"/>
-          <w:u w:val="none"/>
-          <w:shd w:fill="auto" w:val="clear"/>
-          <w:vertAlign w:val="baseline"/>
-        </w:rPr>
-        <w:t xml:space="preserve">Stage the changes:   </w:t>
-      </w:r>
-      <w:r>
-        <w:rPr>
-          <w:rFonts w:eastAsia="Courier New" w:cs="Courier New" w:ascii="Ubuntu Sans Mono" w:hAnsi="Ubuntu Sans Mono"/>
-          <w:b w:val="false"/>
-          <w:bCs w:val="false"/>
-          <w:i w:val="false"/>
-          <w:iCs w:val="false"/>
-          <w:caps w:val="false"/>
-          <w:smallCaps w:val="false"/>
-          <w:strike w:val="false"/>
-          <w:dstrike w:val="false"/>
-          <w:color w:val="1D4ED8"/>
-          <w:position w:val="0"/>
-          <w:sz w:val="22"/>
-          <w:szCs w:val="22"/>
-          <w:u w:val="none"/>
-          <w:shd w:fill="auto" w:val="clear"/>
-          <w:vertAlign w:val="baseline"/>
-        </w:rPr>
-        <w:t>git add .</w:t>
-      </w:r>
-    </w:p>
-    <w:p>
-      <w:pPr>
-        <w:pStyle w:val="normal1"/>
-        <w:keepNext w:val="false"/>
-        <w:keepLines w:val="false"/>
-        <w:pageBreakBefore w:val="false"/>
-        <w:widowControl/>
-        <w:numPr>
-          <w:ilvl w:val="0"/>
-          <w:numId w:val="1"/>
-        </w:numPr>
-        <w:shd w:val="clear" w:fill="auto"/>
-        <w:spacing w:lineRule="auto" w:line="240" w:before="40" w:after="80"/>
-        <w:ind w:hanging="360" w:start="720" w:end="0"/>
-        <w:jc w:val="start"/>
-        <w:rPr>
-          <w:rFonts w:ascii="Ubuntu Sans Mono" w:hAnsi="Ubuntu Sans Mono"/>
-        </w:rPr>
-      </w:pPr>
-      <w:r>
-        <w:rPr>
-          <w:rFonts w:eastAsia="Arial" w:cs="Arial" w:ascii="Ubuntu Sans Mono" w:hAnsi="Ubuntu Sans Mono"/>
-          <w:b w:val="false"/>
-          <w:bCs w:val="false"/>
-          <w:i w:val="false"/>
-          <w:iCs w:val="false"/>
-          <w:caps w:val="false"/>
-          <w:smallCaps w:val="false"/>
-          <w:strike w:val="false"/>
-          <w:dstrike w:val="false"/>
-          <w:color w:val="374151"/>
-          <w:position w:val="0"/>
-          <w:sz w:val="22"/>
-          <w:szCs w:val="22"/>
-          <w:u w:val="none"/>
-          <w:shd w:fill="auto" w:val="clear"/>
-          <w:vertAlign w:val="baseline"/>
-        </w:rPr>
-        <w:t xml:space="preserve">Commit with a message:   </w:t>
-      </w:r>
-      <w:r>
-        <w:rPr>
-          <w:rFonts w:eastAsia="Courier New" w:cs="Courier New" w:ascii="Ubuntu Sans Mono" w:hAnsi="Ubuntu Sans Mono"/>
-          <w:b w:val="false"/>
-          <w:bCs w:val="false"/>
-          <w:i w:val="false"/>
-          <w:iCs w:val="false"/>
-          <w:caps w:val="false"/>
-          <w:smallCaps w:val="false"/>
-          <w:strike w:val="false"/>
-          <w:dstrike w:val="false"/>
-          <w:color w:val="1D4ED8"/>
-          <w:position w:val="0"/>
-          <w:sz w:val="22"/>
-          <w:szCs w:val="22"/>
-          <w:u w:val="none"/>
-          <w:shd w:fill="auto" w:val="clear"/>
-          <w:vertAlign w:val="baseline"/>
-        </w:rPr>
-        <w:t>git commit -m "What I changed"</w:t>
-      </w:r>
-    </w:p>
-    <w:p>
-      <w:pPr>
-        <w:pStyle w:val="normal1"/>
-        <w:keepNext w:val="false"/>
-        <w:keepLines w:val="false"/>
-        <w:pageBreakBefore w:val="false"/>
-        <w:widowControl/>
-        <w:numPr>
-          <w:ilvl w:val="0"/>
-          <w:numId w:val="1"/>
-        </w:numPr>
-        <w:shd w:val="clear" w:fill="auto"/>
-        <w:spacing w:lineRule="auto" w:line="240" w:before="40" w:after="80"/>
-        <w:ind w:hanging="360" w:start="720" w:end="0"/>
-        <w:jc w:val="start"/>
-        <w:rPr>
-          <w:rFonts w:ascii="Ubuntu Sans Mono" w:hAnsi="Ubuntu Sans Mono"/>
-        </w:rPr>
-      </w:pPr>
-      <w:r>
-        <w:rPr>
-          <w:rFonts w:eastAsia="Arial" w:cs="Arial" w:ascii="Ubuntu Sans Mono" w:hAnsi="Ubuntu Sans Mono"/>
-          <w:b w:val="false"/>
-          <w:bCs w:val="false"/>
-          <w:i w:val="false"/>
-          <w:iCs w:val="false"/>
-          <w:caps w:val="false"/>
-          <w:smallCaps w:val="false"/>
-          <w:strike w:val="false"/>
-          <w:dstrike w:val="false"/>
-          <w:color w:val="374151"/>
-          <w:position w:val="0"/>
-          <w:sz w:val="22"/>
-          <w:szCs w:val="22"/>
-          <w:u w:val="none"/>
-          <w:shd w:fill="auto" w:val="clear"/>
-          <w:vertAlign w:val="baseline"/>
-        </w:rPr>
-        <w:t xml:space="preserve">Push to GitHub:   </w:t>
-      </w:r>
-      <w:r>
-        <w:rPr>
-          <w:rFonts w:eastAsia="Courier New" w:cs="Courier New" w:ascii="Ubuntu Sans Mono" w:hAnsi="Ubuntu Sans Mono"/>
-          <w:b w:val="false"/>
-          <w:bCs w:val="false"/>
-          <w:i w:val="false"/>
-          <w:iCs w:val="false"/>
-          <w:caps w:val="false"/>
-          <w:smallCaps w:val="false"/>
-          <w:strike w:val="false"/>
-          <w:dstrike w:val="false"/>
-          <w:color w:val="1D4ED8"/>
-          <w:position w:val="0"/>
-          <w:sz w:val="22"/>
-          <w:szCs w:val="22"/>
-          <w:u w:val="none"/>
-          <w:shd w:fill="auto" w:val="clear"/>
-          <w:vertAlign w:val="baseline"/>
-        </w:rPr>
-        <w:t>git push</w:t>
-      </w:r>
-    </w:p>
-    <w:p>
-      <w:pPr>
-        <w:pStyle w:val="normal1"/>
-        <w:spacing w:lineRule="auto" w:line="240" w:before="160" w:after="0"/>
-        <w:rPr>
-          <w:rFonts w:ascii="Ubuntu Sans Mono" w:hAnsi="Ubuntu Sans Mono"/>
-        </w:rPr>
-      </w:pPr>
-      <w:r>
-        <w:rPr>
-          <w:rFonts w:ascii="Ubuntu Sans Mono" w:hAnsi="Ubuntu Sans Mono"/>
-        </w:rPr>
-      </w:r>
-    </w:p>
-    <w:p>
-      <w:pPr>
-        <w:pStyle w:val="Heading2"/>
-        <w:spacing w:lineRule="auto" w:line="240" w:before="240" w:after="120"/>
-        <w:rPr>
-          <w:rFonts w:ascii="Ubuntu Sans Mono" w:hAnsi="Ubuntu Sans Mono"/>
-        </w:rPr>
-      </w:pPr>
-      <w:r>
-        <w:rPr>
-          <w:rFonts w:eastAsia="Arial" w:cs="Arial" w:ascii="Ubuntu Sans Mono" w:hAnsi="Ubuntu Sans Mono"/>
-          <w:b/>
-          <w:bCs/>
-          <w:color w:val="2563EB"/>
-          <w:sz w:val="26"/>
-          <w:szCs w:val="26"/>
-        </w:rPr>
-        <w:t>Important — files that must never be committed</w:t>
-      </w:r>
-    </w:p>
     <w:tbl>
       <w:tblPr>
         <w:tblStyle w:val="Table11"/>
@@ -4294,14 +3471,14 @@
         <w:tblLook w:val="0000"/>
       </w:tblPr>
       <w:tblGrid>
-        <w:gridCol w:w="2798"/>
-        <w:gridCol w:w="6562"/>
+        <w:gridCol w:w="2796"/>
+        <w:gridCol w:w="6564"/>
       </w:tblGrid>
       <w:tr>
         <w:trPr/>
         <w:tc>
           <w:tcPr>
-            <w:tcW w:w="2798" w:type="dxa"/>
+            <w:tcW w:w="2796" w:type="dxa"/>
             <w:tcBorders>
               <w:top w:val="single" w:sz="4" w:space="0" w:color="E5E7EB"/>
               <w:start w:val="single" w:sz="4" w:space="0" w:color="E5E7EB"/>
@@ -4332,7 +3509,7 @@
         </w:tc>
         <w:tc>
           <w:tcPr>
-            <w:tcW w:w="6562" w:type="dxa"/>
+            <w:tcW w:w="6564" w:type="dxa"/>
             <w:tcBorders>
               <w:top w:val="single" w:sz="4" w:space="0" w:color="E5E7EB"/>
               <w:start w:val="single" w:sz="4" w:space="0" w:color="E5E7EB"/>
@@ -4366,7 +3543,7 @@
         <w:trPr/>
         <w:tc>
           <w:tcPr>
-            <w:tcW w:w="2798" w:type="dxa"/>
+            <w:tcW w:w="2796" w:type="dxa"/>
             <w:tcBorders>
               <w:top w:val="single" w:sz="4" w:space="0" w:color="E5E7EB"/>
               <w:start w:val="single" w:sz="4" w:space="0" w:color="E5E7EB"/>
@@ -4397,7 +3574,7 @@
         </w:tc>
         <w:tc>
           <w:tcPr>
-            <w:tcW w:w="6562" w:type="dxa"/>
+            <w:tcW w:w="6564" w:type="dxa"/>
             <w:tcBorders>
               <w:top w:val="single" w:sz="4" w:space="0" w:color="E5E7EB"/>
               <w:start w:val="single" w:sz="4" w:space="0" w:color="E5E7EB"/>
@@ -4429,7 +3606,7 @@
         <w:trPr/>
         <w:tc>
           <w:tcPr>
-            <w:tcW w:w="2798" w:type="dxa"/>
+            <w:tcW w:w="2796" w:type="dxa"/>
             <w:tcBorders>
               <w:top w:val="single" w:sz="4" w:space="0" w:color="E5E7EB"/>
               <w:start w:val="single" w:sz="4" w:space="0" w:color="E5E7EB"/>
@@ -4460,7 +3637,7 @@
         </w:tc>
         <w:tc>
           <w:tcPr>
-            <w:tcW w:w="6562" w:type="dxa"/>
+            <w:tcW w:w="6564" w:type="dxa"/>
             <w:tcBorders>
               <w:top w:val="single" w:sz="4" w:space="0" w:color="E5E7EB"/>
               <w:start w:val="single" w:sz="4" w:space="0" w:color="E5E7EB"/>
@@ -4489,20 +3666,6 @@
         </w:tc>
       </w:tr>
     </w:tbl>
-    <w:p>
-      <w:pPr>
-        <w:pStyle w:val="normal1"/>
-        <w:spacing w:lineRule="auto" w:line="240" w:before="400" w:after="0"/>
-        <w:rPr>
-          <w:rFonts w:ascii="Ubuntu Sans Mono" w:hAnsi="Ubuntu Sans Mono"/>
-        </w:rPr>
-      </w:pPr>
-      <w:r>
-        <w:rPr>
-          <w:rFonts w:ascii="Ubuntu Sans Mono" w:hAnsi="Ubuntu Sans Mono"/>
-        </w:rPr>
-      </w:r>
-    </w:p>
     <w:tbl>
       <w:tblPr>
         <w:tblStyle w:val="Table12"/>
@@ -4558,23 +3721,260 @@
     </w:tbl>
     <w:p>
       <w:pPr>
+        <w:pStyle w:val="Heading2"/>
+        <w:rPr/>
+      </w:pPr>
+      <w:r>
+        <w:rPr/>
+        <w:t>Project file structure</w:t>
+      </w:r>
+    </w:p>
+    <w:p>
+      <w:pPr>
         <w:pStyle w:val="normal1"/>
-        <w:keepNext w:val="false"/>
-        <w:keepLines w:val="false"/>
-        <w:pageBreakBefore w:val="false"/>
-        <w:widowControl w:val="false"/>
-        <w:shd w:val="clear" w:fill="auto"/>
-        <w:spacing w:lineRule="auto" w:line="276" w:before="0" w:after="0"/>
-        <w:ind w:hanging="0" w:start="0" w:end="0"/>
-        <w:jc w:val="start"/>
-        <w:rPr>
-          <w:rFonts w:ascii="Ubuntu Sans Mono" w:hAnsi="Ubuntu Sans Mono"/>
-        </w:rPr>
+        <w:rPr/>
       </w:pPr>
       <w:r>
-        <w:rPr>
-          <w:rFonts w:ascii="Ubuntu Sans Mono" w:hAnsi="Ubuntu Sans Mono"/>
-        </w:rPr>
+        <w:rPr/>
+        <w:t>The project lives in a folder called Performance-Intelligence-Agent with this layout:</w:t>
+      </w:r>
+    </w:p>
+    <w:p>
+      <w:pPr>
+        <w:pStyle w:val="normal1"/>
+        <w:rPr/>
+      </w:pPr>
+      <w:r>
+        <w:rPr/>
+      </w:r>
+    </w:p>
+    <w:p>
+      <w:pPr>
+        <w:pStyle w:val="normal1"/>
+        <w:rPr/>
+      </w:pPr>
+      <w:r>
+        <w:rPr/>
+        <w:t>Performance-Intelligence-Agent/</w:t>
+      </w:r>
+    </w:p>
+    <w:p>
+      <w:pPr>
+        <w:pStyle w:val="normal1"/>
+        <w:rPr/>
+      </w:pPr>
+      <w:r>
+        <w:rPr/>
+        <w:t xml:space="preserve">├── </w:t>
+      </w:r>
+      <w:r>
+        <w:rPr/>
+        <w:t>data/</w:t>
+      </w:r>
+    </w:p>
+    <w:p>
+      <w:pPr>
+        <w:pStyle w:val="normal1"/>
+        <w:rPr/>
+      </w:pPr>
+      <w:r>
+        <w:rPr/>
+        <w:t xml:space="preserve">│   └── </w:t>
+      </w:r>
+      <w:r>
+        <w:rPr/>
+        <w:t>workouts.csv          ← SugarWOD export (never committed)</w:t>
+      </w:r>
+    </w:p>
+    <w:p>
+      <w:pPr>
+        <w:pStyle w:val="normal1"/>
+        <w:rPr/>
+      </w:pPr>
+      <w:r>
+        <w:rPr/>
+        <w:t xml:space="preserve">├── </w:t>
+      </w:r>
+      <w:r>
+        <w:rPr/>
+        <w:t>analysis/</w:t>
+      </w:r>
+    </w:p>
+    <w:p>
+      <w:pPr>
+        <w:pStyle w:val="normal1"/>
+        <w:rPr/>
+      </w:pPr>
+      <w:r>
+        <w:rPr/>
+        <w:t xml:space="preserve">│   ├── </w:t>
+      </w:r>
+      <w:r>
+        <w:rPr/>
+        <w:t>__init__.py</w:t>
+      </w:r>
+    </w:p>
+    <w:p>
+      <w:pPr>
+        <w:pStyle w:val="normal1"/>
+        <w:rPr/>
+      </w:pPr>
+      <w:r>
+        <w:rPr/>
+        <w:t xml:space="preserve">│   ├── </w:t>
+      </w:r>
+      <w:r>
+        <w:rPr/>
+        <w:t>attendance.py         ← monthly/weekly charts, gap detection</w:t>
+      </w:r>
+    </w:p>
+    <w:p>
+      <w:pPr>
+        <w:pStyle w:val="normal1"/>
+        <w:rPr/>
+      </w:pPr>
+      <w:r>
+        <w:rPr/>
+        <w:t xml:space="preserve">│   ├── </w:t>
+      </w:r>
+      <w:r>
+        <w:rPr/>
+        <w:t>sentiment.py          ← keyword scoring, word frequency, vs-RX</w:t>
+      </w:r>
+    </w:p>
+    <w:p>
+      <w:pPr>
+        <w:pStyle w:val="normal1"/>
+        <w:rPr/>
+      </w:pPr>
+      <w:r>
+        <w:rPr/>
+        <w:t xml:space="preserve">│   ├── </w:t>
+      </w:r>
+      <w:r>
+        <w:rPr/>
+        <w:t>performance.py        ← RX rate, strength, lift heatmap, PRs</w:t>
+      </w:r>
+    </w:p>
+    <w:p>
+      <w:pPr>
+        <w:pStyle w:val="normal1"/>
+        <w:rPr/>
+      </w:pPr>
+      <w:r>
+        <w:rPr/>
+        <w:t xml:space="preserve">│   └── </w:t>
+      </w:r>
+      <w:r>
+        <w:rPr/>
+        <w:t>ml_models.py          ← KMeans, Isolation Forest, block-aware forecasting</w:t>
+      </w:r>
+    </w:p>
+    <w:p>
+      <w:pPr>
+        <w:pStyle w:val="normal1"/>
+        <w:rPr/>
+      </w:pPr>
+      <w:r>
+        <w:rPr/>
+        <w:t xml:space="preserve">├── </w:t>
+      </w:r>
+      <w:r>
+        <w:rPr/>
+        <w:t>loader.py                 ← single source of data loading &amp; cleaning</w:t>
+      </w:r>
+    </w:p>
+    <w:p>
+      <w:pPr>
+        <w:pStyle w:val="normal1"/>
+        <w:rPr/>
+      </w:pPr>
+      <w:r>
+        <w:rPr/>
+        <w:t xml:space="preserve">├── </w:t>
+      </w:r>
+      <w:r>
+        <w:rPr/>
+        <w:t>tools.py                  ← wraps analysis as Claude agent tools</w:t>
+      </w:r>
+    </w:p>
+    <w:p>
+      <w:pPr>
+        <w:pStyle w:val="normal1"/>
+        <w:rPr/>
+      </w:pPr>
+      <w:r>
+        <w:rPr/>
+        <w:t xml:space="preserve">├── </w:t>
+      </w:r>
+      <w:r>
+        <w:rPr/>
+        <w:t>agent.py                  ← Claude tool-use loop (Anthropic API)</w:t>
+      </w:r>
+    </w:p>
+    <w:p>
+      <w:pPr>
+        <w:pStyle w:val="normal1"/>
+        <w:rPr/>
+      </w:pPr>
+      <w:r>
+        <w:rPr/>
+        <w:t xml:space="preserve">├── </w:t>
+      </w:r>
+      <w:r>
+        <w:rPr/>
+        <w:t>app.py                    ← Streamlit chat interface</w:t>
+      </w:r>
+    </w:p>
+    <w:p>
+      <w:pPr>
+        <w:pStyle w:val="normal1"/>
+        <w:rPr/>
+      </w:pPr>
+      <w:r>
+        <w:rPr/>
+        <w:t xml:space="preserve">├── </w:t>
+      </w:r>
+      <w:r>
+        <w:rPr/>
+        <w:t>requirements.txt</w:t>
+      </w:r>
+    </w:p>
+    <w:p>
+      <w:pPr>
+        <w:pStyle w:val="normal1"/>
+        <w:rPr/>
+      </w:pPr>
+      <w:r>
+        <w:rPr/>
+        <w:t xml:space="preserve">├── </w:t>
+      </w:r>
+      <w:r>
+        <w:rPr/>
+        <w:t>README.md</w:t>
+      </w:r>
+    </w:p>
+    <w:p>
+      <w:pPr>
+        <w:pStyle w:val="normal1"/>
+        <w:rPr/>
+      </w:pPr>
+      <w:r>
+        <w:rPr/>
+        <w:t xml:space="preserve">└── </w:t>
+      </w:r>
+      <w:r>
+        <w:rPr/>
+        <w:t>.gitignore</w:t>
+      </w:r>
+    </w:p>
+    <w:p>
+      <w:pPr>
+        <w:pStyle w:val="normal1"/>
+        <w:rPr/>
+      </w:pPr>
+      <w:r>
+        <w:rPr/>
       </w:r>
     </w:p>
     <w:sectPr>
@@ -4588,271 +3988,6 @@
     </w:sectPr>
   </w:body>
 </w:document>
-</file>
-
-<file path=word/numbering.xml><?xml version="1.0" encoding="utf-8"?>
-<w:numbering xmlns:w="http://schemas.openxmlformats.org/wordprocessingml/2006/main" xmlns:o="urn:schemas-microsoft-com:office:office" xmlns:r="http://schemas.openxmlformats.org/officeDocument/2006/relationships" xmlns:v="urn:schemas-microsoft-com:vml" xmlns:mc="http://schemas.openxmlformats.org/markup-compatibility/2006" xmlns:w14="http://schemas.microsoft.com/office/word/2010/wordml" mc:Ignorable="w14">
-  <w:abstractNum w:abstractNumId="1">
-    <w:lvl w:ilvl="0">
-      <w:start w:val="1"/>
-      <w:numFmt w:val="decimal"/>
-      <w:lvlText w:val="%1."/>
-      <w:lvlJc w:val="start"/>
-      <w:pPr>
-        <w:tabs>
-          <w:tab w:val="num" w:pos="0"/>
-        </w:tabs>
-        <w:ind w:start="720" w:hanging="360"/>
-      </w:pPr>
-      <w:rPr/>
-    </w:lvl>
-    <w:lvl w:ilvl="1">
-      <w:start w:val="1"/>
-      <w:numFmt w:val="bullet"/>
-      <w:lvlText w:val=""/>
-      <w:lvlJc w:val="start"/>
-      <w:pPr>
-        <w:tabs>
-          <w:tab w:val="num" w:pos="0"/>
-        </w:tabs>
-        <w:ind w:start="0" w:hanging="0"/>
-      </w:pPr>
-      <w:rPr>
-        <w:rFonts w:ascii="OpenSymbol" w:hAnsi="OpenSymbol" w:cs="OpenSymbol" w:hint="default"/>
-      </w:rPr>
-    </w:lvl>
-    <w:lvl w:ilvl="2">
-      <w:start w:val="1"/>
-      <w:numFmt w:val="bullet"/>
-      <w:lvlText w:val=""/>
-      <w:lvlJc w:val="start"/>
-      <w:pPr>
-        <w:tabs>
-          <w:tab w:val="num" w:pos="0"/>
-        </w:tabs>
-        <w:ind w:start="0" w:hanging="0"/>
-      </w:pPr>
-      <w:rPr>
-        <w:rFonts w:ascii="OpenSymbol" w:hAnsi="OpenSymbol" w:cs="OpenSymbol" w:hint="default"/>
-      </w:rPr>
-    </w:lvl>
-    <w:lvl w:ilvl="3">
-      <w:start w:val="1"/>
-      <w:numFmt w:val="bullet"/>
-      <w:lvlText w:val=""/>
-      <w:lvlJc w:val="start"/>
-      <w:pPr>
-        <w:tabs>
-          <w:tab w:val="num" w:pos="0"/>
-        </w:tabs>
-        <w:ind w:start="0" w:hanging="0"/>
-      </w:pPr>
-      <w:rPr>
-        <w:rFonts w:ascii="OpenSymbol" w:hAnsi="OpenSymbol" w:cs="OpenSymbol" w:hint="default"/>
-      </w:rPr>
-    </w:lvl>
-    <w:lvl w:ilvl="4">
-      <w:start w:val="1"/>
-      <w:numFmt w:val="bullet"/>
-      <w:lvlText w:val=""/>
-      <w:lvlJc w:val="start"/>
-      <w:pPr>
-        <w:tabs>
-          <w:tab w:val="num" w:pos="0"/>
-        </w:tabs>
-        <w:ind w:start="0" w:hanging="0"/>
-      </w:pPr>
-      <w:rPr>
-        <w:rFonts w:ascii="OpenSymbol" w:hAnsi="OpenSymbol" w:cs="OpenSymbol" w:hint="default"/>
-      </w:rPr>
-    </w:lvl>
-    <w:lvl w:ilvl="5">
-      <w:start w:val="1"/>
-      <w:numFmt w:val="bullet"/>
-      <w:lvlText w:val=""/>
-      <w:lvlJc w:val="start"/>
-      <w:pPr>
-        <w:tabs>
-          <w:tab w:val="num" w:pos="0"/>
-        </w:tabs>
-        <w:ind w:start="0" w:hanging="0"/>
-      </w:pPr>
-      <w:rPr>
-        <w:rFonts w:ascii="OpenSymbol" w:hAnsi="OpenSymbol" w:cs="OpenSymbol" w:hint="default"/>
-      </w:rPr>
-    </w:lvl>
-    <w:lvl w:ilvl="6">
-      <w:start w:val="1"/>
-      <w:numFmt w:val="bullet"/>
-      <w:lvlText w:val=""/>
-      <w:lvlJc w:val="start"/>
-      <w:pPr>
-        <w:tabs>
-          <w:tab w:val="num" w:pos="0"/>
-        </w:tabs>
-        <w:ind w:start="0" w:hanging="0"/>
-      </w:pPr>
-      <w:rPr>
-        <w:rFonts w:ascii="OpenSymbol" w:hAnsi="OpenSymbol" w:cs="OpenSymbol" w:hint="default"/>
-      </w:rPr>
-    </w:lvl>
-    <w:lvl w:ilvl="7">
-      <w:start w:val="1"/>
-      <w:numFmt w:val="bullet"/>
-      <w:lvlText w:val=""/>
-      <w:lvlJc w:val="start"/>
-      <w:pPr>
-        <w:tabs>
-          <w:tab w:val="num" w:pos="0"/>
-        </w:tabs>
-        <w:ind w:start="0" w:hanging="0"/>
-      </w:pPr>
-      <w:rPr>
-        <w:rFonts w:ascii="OpenSymbol" w:hAnsi="OpenSymbol" w:cs="OpenSymbol" w:hint="default"/>
-      </w:rPr>
-    </w:lvl>
-    <w:lvl w:ilvl="8">
-      <w:start w:val="1"/>
-      <w:numFmt w:val="bullet"/>
-      <w:lvlText w:val=""/>
-      <w:lvlJc w:val="start"/>
-      <w:pPr>
-        <w:tabs>
-          <w:tab w:val="num" w:pos="0"/>
-        </w:tabs>
-        <w:ind w:start="0" w:hanging="0"/>
-      </w:pPr>
-      <w:rPr>
-        <w:rFonts w:ascii="OpenSymbol" w:hAnsi="OpenSymbol" w:cs="OpenSymbol" w:hint="default"/>
-      </w:rPr>
-    </w:lvl>
-  </w:abstractNum>
-  <w:abstractNum w:abstractNumId="2">
-    <w:lvl w:ilvl="0">
-      <w:start w:val="1"/>
-      <w:numFmt w:val="none"/>
-      <w:suff w:val="nothing"/>
-      <w:lvlText w:val=""/>
-      <w:lvlJc w:val="start"/>
-      <w:pPr>
-        <w:tabs>
-          <w:tab w:val="num" w:pos="0"/>
-        </w:tabs>
-        <w:ind w:start="0" w:hanging="0"/>
-      </w:pPr>
-    </w:lvl>
-    <w:lvl w:ilvl="1">
-      <w:start w:val="1"/>
-      <w:numFmt w:val="none"/>
-      <w:suff w:val="nothing"/>
-      <w:lvlText w:val=""/>
-      <w:lvlJc w:val="start"/>
-      <w:pPr>
-        <w:tabs>
-          <w:tab w:val="num" w:pos="0"/>
-        </w:tabs>
-        <w:ind w:start="0" w:hanging="0"/>
-      </w:pPr>
-    </w:lvl>
-    <w:lvl w:ilvl="2">
-      <w:start w:val="1"/>
-      <w:numFmt w:val="none"/>
-      <w:suff w:val="nothing"/>
-      <w:lvlText w:val=""/>
-      <w:lvlJc w:val="start"/>
-      <w:pPr>
-        <w:tabs>
-          <w:tab w:val="num" w:pos="0"/>
-        </w:tabs>
-        <w:ind w:start="0" w:hanging="0"/>
-      </w:pPr>
-    </w:lvl>
-    <w:lvl w:ilvl="3">
-      <w:start w:val="1"/>
-      <w:numFmt w:val="none"/>
-      <w:suff w:val="nothing"/>
-      <w:lvlText w:val=""/>
-      <w:lvlJc w:val="start"/>
-      <w:pPr>
-        <w:tabs>
-          <w:tab w:val="num" w:pos="0"/>
-        </w:tabs>
-        <w:ind w:start="0" w:hanging="0"/>
-      </w:pPr>
-    </w:lvl>
-    <w:lvl w:ilvl="4">
-      <w:start w:val="1"/>
-      <w:numFmt w:val="none"/>
-      <w:suff w:val="nothing"/>
-      <w:lvlText w:val=""/>
-      <w:lvlJc w:val="start"/>
-      <w:pPr>
-        <w:tabs>
-          <w:tab w:val="num" w:pos="0"/>
-        </w:tabs>
-        <w:ind w:start="0" w:hanging="0"/>
-      </w:pPr>
-    </w:lvl>
-    <w:lvl w:ilvl="5">
-      <w:start w:val="1"/>
-      <w:numFmt w:val="none"/>
-      <w:suff w:val="nothing"/>
-      <w:lvlText w:val=""/>
-      <w:lvlJc w:val="start"/>
-      <w:pPr>
-        <w:tabs>
-          <w:tab w:val="num" w:pos="0"/>
-        </w:tabs>
-        <w:ind w:start="0" w:hanging="0"/>
-      </w:pPr>
-    </w:lvl>
-    <w:lvl w:ilvl="6">
-      <w:start w:val="1"/>
-      <w:numFmt w:val="none"/>
-      <w:suff w:val="nothing"/>
-      <w:lvlText w:val=""/>
-      <w:lvlJc w:val="start"/>
-      <w:pPr>
-        <w:tabs>
-          <w:tab w:val="num" w:pos="0"/>
-        </w:tabs>
-        <w:ind w:start="0" w:hanging="0"/>
-      </w:pPr>
-    </w:lvl>
-    <w:lvl w:ilvl="7">
-      <w:start w:val="1"/>
-      <w:numFmt w:val="none"/>
-      <w:suff w:val="nothing"/>
-      <w:lvlText w:val=""/>
-      <w:lvlJc w:val="start"/>
-      <w:pPr>
-        <w:tabs>
-          <w:tab w:val="num" w:pos="0"/>
-        </w:tabs>
-        <w:ind w:start="0" w:hanging="0"/>
-      </w:pPr>
-    </w:lvl>
-    <w:lvl w:ilvl="8">
-      <w:start w:val="1"/>
-      <w:numFmt w:val="none"/>
-      <w:suff w:val="nothing"/>
-      <w:lvlText w:val=""/>
-      <w:lvlJc w:val="start"/>
-      <w:pPr>
-        <w:tabs>
-          <w:tab w:val="num" w:pos="0"/>
-        </w:tabs>
-        <w:ind w:start="0" w:hanging="0"/>
-      </w:pPr>
-    </w:lvl>
-  </w:abstractNum>
-  <w:num w:numId="1">
-    <w:abstractNumId w:val="1"/>
-  </w:num>
-  <w:num w:numId="2">
-    <w:abstractNumId w:val="2"/>
-  </w:num>
-</w:numbering>
 </file>
 
 <file path=word/styles.xml><?xml version="1.0" encoding="utf-8"?>
@@ -5226,6 +4361,29 @@
       <w:szCs w:val="48"/>
     </w:rPr>
   </w:style>
+  <w:style w:type="paragraph" w:styleId="TableContents">
+    <w:name w:val="Table Contents"/>
+    <w:basedOn w:val="Normal"/>
+    <w:qFormat/>
+    <w:pPr>
+      <w:widowControl w:val="false"/>
+      <w:suppressLineNumbers/>
+    </w:pPr>
+    <w:rPr/>
+  </w:style>
+  <w:style w:type="paragraph" w:styleId="TableHeading">
+    <w:name w:val="Table Heading"/>
+    <w:basedOn w:val="TableContents"/>
+    <w:qFormat/>
+    <w:pPr>
+      <w:suppressLineNumbers/>
+      <w:jc w:val="center"/>
+    </w:pPr>
+    <w:rPr>
+      <w:b/>
+      <w:bCs/>
+    </w:rPr>
+  </w:style>
   <w:style w:type="table" w:default="1" w:styleId="TableNormal">
     <w:name w:val="TableNormal"/>
     <w:tblPr>

</xml_diff>

<commit_message>
Update docs, move storyboard to root, and ignore media/lock files
- Updated walkthrough, capstone responses, project plan, and summary docs
- Moved storyboard pptx from subfolder to project root
- Removed files.zip
- Added lock file and video formats to .gitignore

Co-Authored-By: Claude Sonnet 4.6 <noreply@anthropic.com>
</commit_message>
<xml_diff>
--- a/project_plan_skillsforhire.docx
+++ b/project_plan_skillsforhire.docx
@@ -2505,18 +2505,7 @@
                 <w:sz w:val="34"/>
                 <w:szCs w:val="34"/>
               </w:rPr>
-              <w:t xml:space="preserve">Next Steps — Before Capstone Submission - </w:t>
-            </w:r>
-            <w:r>
-              <w:rPr>
-                <w:rFonts w:eastAsia="Arial" w:cs="Arial" w:ascii="Ubuntu Sans Mono" w:hAnsi="Ubuntu Sans Mono"/>
-                <w:b/>
-                <w:bCs/>
-                <w:color w:val="FFFFFF"/>
-                <w:sz w:val="34"/>
-                <w:szCs w:val="34"/>
-              </w:rPr>
-              <w:t>OK</w:t>
+              <w:t>Next Steps — Before Capstone Submission - OK</w:t>
             </w:r>
           </w:p>
         </w:tc>
@@ -2955,7 +2944,18 @@
                 <w:sz w:val="19"/>
                 <w:szCs w:val="19"/>
               </w:rPr>
-              <w:t>FIX IT</w:t>
+              <w:t xml:space="preserve">FIX IT </w:t>
+            </w:r>
+            <w:r>
+              <w:rPr>
+                <w:rFonts w:eastAsia="Arial" w:cs="Arial" w:ascii="Ubuntu Sans Mono" w:hAnsi="Ubuntu Sans Mono"/>
+                <w:b/>
+                <w:bCs/>
+                <w:color w:val="FF4000"/>
+                <w:sz w:val="19"/>
+                <w:szCs w:val="19"/>
+              </w:rPr>
+              <w:t>($)</w:t>
             </w:r>
           </w:p>
         </w:tc>
@@ -3386,6 +3386,26 @@
                 <w:szCs w:val="19"/>
               </w:rPr>
               <w:t>Submit</w:t>
+            </w:r>
+          </w:p>
+          <w:p>
+            <w:pPr>
+              <w:pStyle w:val="normal1"/>
+              <w:jc w:val="center"/>
+              <w:rPr>
+                <w:color w:val="FF4000"/>
+              </w:rPr>
+            </w:pPr>
+            <w:r>
+              <w:rPr>
+                <w:rFonts w:eastAsia="Arial" w:cs="Arial" w:ascii="Ubuntu Sans Mono" w:hAnsi="Ubuntu Sans Mono"/>
+                <w:b/>
+                <w:bCs/>
+                <w:color w:val="FF4000"/>
+                <w:sz w:val="19"/>
+                <w:szCs w:val="19"/>
+              </w:rPr>
+              <w:t>(couldn’t get the sound to work)</w:t>
             </w:r>
           </w:p>
         </w:tc>
@@ -3438,18 +3458,7 @@
                 <w:sz w:val="34"/>
                 <w:szCs w:val="34"/>
               </w:rPr>
-              <w:t xml:space="preserve">GitHub Reminders – </w:t>
-            </w:r>
-            <w:r>
-              <w:rPr>
-                <w:rFonts w:eastAsia="Arial" w:cs="Arial" w:ascii="Ubuntu Sans Mono" w:hAnsi="Ubuntu Sans Mono"/>
-                <w:b/>
-                <w:bCs/>
-                <w:color w:val="FFFFFF"/>
-                <w:sz w:val="34"/>
-                <w:szCs w:val="34"/>
-              </w:rPr>
-              <w:t>DO NOT COMMIT:</w:t>
+              <w:t>GitHub Reminders – DO NOT COMMIT:</w:t>
             </w:r>
           </w:p>
         </w:tc>
@@ -3471,14 +3480,14 @@
         <w:tblLook w:val="0000"/>
       </w:tblPr>
       <w:tblGrid>
-        <w:gridCol w:w="2796"/>
-        <w:gridCol w:w="6564"/>
+        <w:gridCol w:w="2795"/>
+        <w:gridCol w:w="6565"/>
       </w:tblGrid>
       <w:tr>
         <w:trPr/>
         <w:tc>
           <w:tcPr>
-            <w:tcW w:w="2796" w:type="dxa"/>
+            <w:tcW w:w="2795" w:type="dxa"/>
             <w:tcBorders>
               <w:top w:val="single" w:sz="4" w:space="0" w:color="E5E7EB"/>
               <w:start w:val="single" w:sz="4" w:space="0" w:color="E5E7EB"/>
@@ -3509,7 +3518,7 @@
         </w:tc>
         <w:tc>
           <w:tcPr>
-            <w:tcW w:w="6564" w:type="dxa"/>
+            <w:tcW w:w="6565" w:type="dxa"/>
             <w:tcBorders>
               <w:top w:val="single" w:sz="4" w:space="0" w:color="E5E7EB"/>
               <w:start w:val="single" w:sz="4" w:space="0" w:color="E5E7EB"/>
@@ -3543,7 +3552,7 @@
         <w:trPr/>
         <w:tc>
           <w:tcPr>
-            <w:tcW w:w="2796" w:type="dxa"/>
+            <w:tcW w:w="2795" w:type="dxa"/>
             <w:tcBorders>
               <w:top w:val="single" w:sz="4" w:space="0" w:color="E5E7EB"/>
               <w:start w:val="single" w:sz="4" w:space="0" w:color="E5E7EB"/>
@@ -3574,7 +3583,7 @@
         </w:tc>
         <w:tc>
           <w:tcPr>
-            <w:tcW w:w="6564" w:type="dxa"/>
+            <w:tcW w:w="6565" w:type="dxa"/>
             <w:tcBorders>
               <w:top w:val="single" w:sz="4" w:space="0" w:color="E5E7EB"/>
               <w:start w:val="single" w:sz="4" w:space="0" w:color="E5E7EB"/>
@@ -3597,7 +3606,25 @@
                 <w:sz w:val="22"/>
                 <w:szCs w:val="22"/>
               </w:rPr>
-              <w:t>Contains your ANTHROPIC_API_KEY. If this goes on GitHub anyone can find it and use your API credits. Already in .gitignore.</w:t>
+              <w:t xml:space="preserve">Contains your ANTHROPIC_API_KEY. If this goes on GitHub anyone can find it and use </w:t>
+            </w:r>
+            <w:r>
+              <w:rPr>
+                <w:rFonts w:eastAsia="Arial" w:cs="Arial" w:ascii="Ubuntu Sans Mono" w:hAnsi="Ubuntu Sans Mono"/>
+                <w:color w:val="6B7280"/>
+                <w:sz w:val="22"/>
+                <w:szCs w:val="22"/>
+              </w:rPr>
+              <w:t>my</w:t>
+            </w:r>
+            <w:r>
+              <w:rPr>
+                <w:rFonts w:eastAsia="Arial" w:cs="Arial" w:ascii="Ubuntu Sans Mono" w:hAnsi="Ubuntu Sans Mono"/>
+                <w:color w:val="6B7280"/>
+                <w:sz w:val="22"/>
+                <w:szCs w:val="22"/>
+              </w:rPr>
+              <w:t xml:space="preserve"> API credits. Already in .gitignore.</w:t>
             </w:r>
           </w:p>
         </w:tc>
@@ -3606,7 +3633,7 @@
         <w:trPr/>
         <w:tc>
           <w:tcPr>
-            <w:tcW w:w="2796" w:type="dxa"/>
+            <w:tcW w:w="2795" w:type="dxa"/>
             <w:tcBorders>
               <w:top w:val="single" w:sz="4" w:space="0" w:color="E5E7EB"/>
               <w:start w:val="single" w:sz="4" w:space="0" w:color="E5E7EB"/>
@@ -3637,7 +3664,7 @@
         </w:tc>
         <w:tc>
           <w:tcPr>
-            <w:tcW w:w="6564" w:type="dxa"/>
+            <w:tcW w:w="6565" w:type="dxa"/>
             <w:tcBorders>
               <w:top w:val="single" w:sz="4" w:space="0" w:color="E5E7EB"/>
               <w:start w:val="single" w:sz="4" w:space="0" w:color="E5E7EB"/>

</xml_diff>